<commit_message>
docs: Anforderungsaenderung 15.10.2026 - ein Projekt, ein Video (AD v1.7 / TK v3.21)
User-Entscheidungen aus der Abnahme der Kernachse (#416-#421):
- genau EIN Video pro Projekt (ueberstimmt AD FA-01/03/05)
- Import ist Teil des Anlegens; im Composer "Video importieren"
- neu importiertes Video automatisch ans Listenende
- erneuter Import ersetzt mit Bestaetigung; Durchsetzung nur in der Oberflaeche

Dokumente:
- AD v1.7: FA-01/FA-03/FA-05 geschaerft, neuer Abschnitt 4.9, Akzeptanzkriterium 1
- TK v3.21: neuer 9.7.6 (Composer), 9.14.3 (Anlege-Weg)
Nachzuege NA-03 (composer) und NA-04 (projekt-verwaltung) angelegt.
</commit_message>
<xml_diff>
--- a/docs/Anforderungsdokument_Digital-Signage-Tool.docx
+++ b/docs/Anforderungsdokument_Digital-Signage-Tool.docx
@@ -162,7 +162,7 @@
           <w:sz w:val="20"/>
           <w:szCs w:val="20"/>
         </w:rPr>
-        <w:t xml:space="preserve"> 15.08.2026</w:t>
+        <w:t xml:space="preserve"> 15.10.2026</w:t>
       </w:r>
     </w:p>
     <w:p>
@@ -185,7 +185,25 @@
           <w:sz w:val="20"/>
           <w:szCs w:val="20"/>
         </w:rPr>
-        <w:t xml:space="preserve"> 1.6 (Entwurf – Reichweite der Standarddauer geschärft: bereits platzierte Elemente bleiben unberührt)</w:t>
+        <w:t xml:space="preserve"> 1.7 (Ein Projekt – ein Video: genau </w:t>
+      </w:r>
+      <w:r>
+        <w:rPr>
+          <w:rFonts w:ascii="Arial" w:cs="Arial" w:eastAsia="Arial" w:hAnsi="Arial"/>
+          <w:b/>
+          <w:bCs/>
+          <w:sz w:val="20"/>
+          <w:szCs w:val="20"/>
+        </w:rPr>
+        <w:t xml:space="preserve">ein</w:t>
+      </w:r>
+      <w:r>
+        <w:rPr>
+          <w:rFonts w:ascii="Arial" w:cs="Arial" w:eastAsia="Arial" w:hAnsi="Arial"/>
+          <w:sz w:val="20"/>
+          <w:szCs w:val="20"/>
+        </w:rPr>
+        <w:t xml:space="preserve"> Video je Projekt, Import beim Anlegen und im Projekt-Editor, Ersetzen mit Bestätigung, automatische Übernahme in die Wiedergabeliste, s. 4.9)</w:t>
       </w:r>
     </w:p>
     <w:p>
@@ -238,11 +256,571 @@
       </w:sdtPr>
       <w:sdtContent>
         <w:p>
+          <w:pPr>
+            <w:pStyle w:val="TOC1"/>
+            <w:tabs>
+              <w:tab w:val="right" w:pos="9026" w:leader="dot"/>
+            </w:tabs>
+          </w:pPr>
           <w:r>
             <w:fldChar w:fldCharType="begin" w:dirty="true"/>
             <w:instrText xml:space="preserve">TOC \h \o "1-2"</w:instrText>
             <w:fldChar w:fldCharType="separate"/>
           </w:r>
+          <w:hyperlink w:history="1" w:anchor="_Toc1">
+            <w:r>
+              <w:t xml:space="preserve">1. Einleitung und Zielsetzung</w:t>
+            </w:r>
+            <w:r>
+              <w:tab/>
+            </w:r>
+            <w:r>
+              <w:fldChar w:fldCharType="begin" w:dirty="true"/>
+              <w:instrText xml:space="preserve">PAGEREF _Toc1 \h</w:instrText>
+              <w:fldChar w:fldCharType="separate"/>
+              <w:fldChar w:fldCharType="end"/>
+            </w:r>
+          </w:hyperlink>
+        </w:p>
+        <w:p>
+          <w:pPr>
+            <w:pStyle w:val="TOC1"/>
+            <w:tabs>
+              <w:tab w:val="right" w:pos="9026" w:leader="dot"/>
+            </w:tabs>
+          </w:pPr>
+          <w:hyperlink w:history="1" w:anchor="_Toc2">
+            <w:r>
+              <w:t xml:space="preserve">2. Ausgangslage und Rahmenbedingungen</w:t>
+            </w:r>
+            <w:r>
+              <w:tab/>
+            </w:r>
+            <w:r>
+              <w:fldChar w:fldCharType="begin" w:dirty="true"/>
+              <w:instrText xml:space="preserve">PAGEREF _Toc2 \h</w:instrText>
+              <w:fldChar w:fldCharType="separate"/>
+              <w:fldChar w:fldCharType="end"/>
+            </w:r>
+          </w:hyperlink>
+        </w:p>
+        <w:p>
+          <w:pPr>
+            <w:pStyle w:val="TOC2"/>
+            <w:tabs>
+              <w:tab w:val="right" w:pos="9026" w:leader="dot"/>
+            </w:tabs>
+            <w:ind w:left="220"/>
+          </w:pPr>
+          <w:hyperlink w:history="1" w:anchor="_Toc3">
+            <w:r>
+              <w:t xml:space="preserve">2.1 Fachlicher Kontext</w:t>
+            </w:r>
+            <w:r>
+              <w:tab/>
+            </w:r>
+            <w:r>
+              <w:fldChar w:fldCharType="begin" w:dirty="true"/>
+              <w:instrText xml:space="preserve">PAGEREF _Toc3 \h</w:instrText>
+              <w:fldChar w:fldCharType="separate"/>
+              <w:fldChar w:fldCharType="end"/>
+            </w:r>
+          </w:hyperlink>
+        </w:p>
+        <w:p>
+          <w:pPr>
+            <w:pStyle w:val="TOC2"/>
+            <w:tabs>
+              <w:tab w:val="right" w:pos="9026" w:leader="dot"/>
+            </w:tabs>
+            <w:ind w:left="220"/>
+          </w:pPr>
+          <w:hyperlink w:history="1" w:anchor="_Toc4">
+            <w:r>
+              <w:t xml:space="preserve">2.2 Hardware-Umgebung (Wiedergabegerät)</w:t>
+            </w:r>
+            <w:r>
+              <w:tab/>
+            </w:r>
+            <w:r>
+              <w:fldChar w:fldCharType="begin" w:dirty="true"/>
+              <w:instrText xml:space="preserve">PAGEREF _Toc4 \h</w:instrText>
+              <w:fldChar w:fldCharType="separate"/>
+              <w:fldChar w:fldCharType="end"/>
+            </w:r>
+          </w:hyperlink>
+        </w:p>
+        <w:p>
+          <w:pPr>
+            <w:pStyle w:val="TOC2"/>
+            <w:tabs>
+              <w:tab w:val="right" w:pos="9026" w:leader="dot"/>
+            </w:tabs>
+            <w:ind w:left="220"/>
+          </w:pPr>
+          <w:hyperlink w:history="1" w:anchor="_Toc5">
+            <w:r>
+              <w:t xml:space="preserve">2.3 Organisatorische Rahmenbedingungen</w:t>
+            </w:r>
+            <w:r>
+              <w:tab/>
+            </w:r>
+            <w:r>
+              <w:fldChar w:fldCharType="begin" w:dirty="true"/>
+              <w:instrText xml:space="preserve">PAGEREF _Toc5 \h</w:instrText>
+              <w:fldChar w:fldCharType="separate"/>
+              <w:fldChar w:fldCharType="end"/>
+            </w:r>
+          </w:hyperlink>
+        </w:p>
+        <w:p>
+          <w:pPr>
+            <w:pStyle w:val="TOC1"/>
+            <w:tabs>
+              <w:tab w:val="right" w:pos="9026" w:leader="dot"/>
+            </w:tabs>
+          </w:pPr>
+          <w:hyperlink w:history="1" w:anchor="_Toc6">
+            <w:r>
+              <w:t xml:space="preserve">3. Systemüberblick / Lösungskonzept</w:t>
+            </w:r>
+            <w:r>
+              <w:tab/>
+            </w:r>
+            <w:r>
+              <w:fldChar w:fldCharType="begin" w:dirty="true"/>
+              <w:instrText xml:space="preserve">PAGEREF _Toc6 \h</w:instrText>
+              <w:fldChar w:fldCharType="separate"/>
+              <w:fldChar w:fldCharType="end"/>
+            </w:r>
+          </w:hyperlink>
+        </w:p>
+        <w:p>
+          <w:pPr>
+            <w:pStyle w:val="TOC1"/>
+            <w:tabs>
+              <w:tab w:val="right" w:pos="9026" w:leader="dot"/>
+            </w:tabs>
+          </w:pPr>
+          <w:hyperlink w:history="1" w:anchor="_Toc7">
+            <w:r>
+              <w:t xml:space="preserve">4. Funktionale Anforderungen</w:t>
+            </w:r>
+            <w:r>
+              <w:tab/>
+            </w:r>
+            <w:r>
+              <w:fldChar w:fldCharType="begin" w:dirty="true"/>
+              <w:instrText xml:space="preserve">PAGEREF _Toc7 \h</w:instrText>
+              <w:fldChar w:fldCharType="separate"/>
+              <w:fldChar w:fldCharType="end"/>
+            </w:r>
+          </w:hyperlink>
+        </w:p>
+        <w:p>
+          <w:pPr>
+            <w:pStyle w:val="TOC2"/>
+            <w:tabs>
+              <w:tab w:val="right" w:pos="9026" w:leader="dot"/>
+            </w:tabs>
+            <w:ind w:left="220"/>
+          </w:pPr>
+          <w:hyperlink w:history="1" w:anchor="_Toc8">
+            <w:r>
+              <w:t xml:space="preserve">4.1 Gestaltung der Aktions-Segmente (Corporate Design)</w:t>
+            </w:r>
+            <w:r>
+              <w:tab/>
+            </w:r>
+            <w:r>
+              <w:fldChar w:fldCharType="begin" w:dirty="true"/>
+              <w:instrText xml:space="preserve">PAGEREF _Toc8 \h</w:instrText>
+              <w:fldChar w:fldCharType="separate"/>
+              <w:fldChar w:fldCharType="end"/>
+            </w:r>
+          </w:hyperlink>
+        </w:p>
+        <w:p>
+          <w:pPr>
+            <w:pStyle w:val="TOC2"/>
+            <w:tabs>
+              <w:tab w:val="right" w:pos="9026" w:leader="dot"/>
+            </w:tabs>
+            <w:ind w:left="220"/>
+          </w:pPr>
+          <w:hyperlink w:history="1" w:anchor="_Toc9">
+            <w:r>
+              <w:t xml:space="preserve">4.2 Design-Tokens / Style-Guide</w:t>
+            </w:r>
+            <w:r>
+              <w:tab/>
+            </w:r>
+            <w:r>
+              <w:fldChar w:fldCharType="begin" w:dirty="true"/>
+              <w:instrText xml:space="preserve">PAGEREF _Toc9 \h</w:instrText>
+              <w:fldChar w:fldCharType="separate"/>
+              <w:fldChar w:fldCharType="end"/>
+            </w:r>
+          </w:hyperlink>
+        </w:p>
+        <w:p>
+          <w:pPr>
+            <w:pStyle w:val="TOC2"/>
+            <w:tabs>
+              <w:tab w:val="right" w:pos="9026" w:leader="dot"/>
+            </w:tabs>
+            <w:ind w:left="220"/>
+          </w:pPr>
+          <w:hyperlink w:history="1" w:anchor="_Toc10">
+            <w:r>
+              <w:t xml:space="preserve">4.3 Prozessverwaltung (Auftrags-Queue)</w:t>
+            </w:r>
+            <w:r>
+              <w:tab/>
+            </w:r>
+            <w:r>
+              <w:fldChar w:fldCharType="begin" w:dirty="true"/>
+              <w:instrText xml:space="preserve">PAGEREF _Toc10 \h</w:instrText>
+              <w:fldChar w:fldCharType="separate"/>
+              <w:fldChar w:fldCharType="end"/>
+            </w:r>
+          </w:hyperlink>
+        </w:p>
+        <w:p>
+          <w:pPr>
+            <w:pStyle w:val="TOC2"/>
+            <w:tabs>
+              <w:tab w:val="right" w:pos="9026" w:leader="dot"/>
+            </w:tabs>
+            <w:ind w:left="220"/>
+          </w:pPr>
+          <w:hyperlink w:history="1" w:anchor="_Toc11">
+            <w:r>
+              <w:t xml:space="preserve">4.4 Dauer und Trim – einheitliche Bedienung</w:t>
+            </w:r>
+            <w:r>
+              <w:tab/>
+            </w:r>
+            <w:r>
+              <w:fldChar w:fldCharType="begin" w:dirty="true"/>
+              <w:instrText xml:space="preserve">PAGEREF _Toc11 \h</w:instrText>
+              <w:fldChar w:fldCharType="separate"/>
+              <w:fldChar w:fldCharType="end"/>
+            </w:r>
+          </w:hyperlink>
+        </w:p>
+        <w:p>
+          <w:pPr>
+            <w:pStyle w:val="TOC2"/>
+            <w:tabs>
+              <w:tab w:val="right" w:pos="9026" w:leader="dot"/>
+            </w:tabs>
+            <w:ind w:left="220"/>
+          </w:pPr>
+          <w:hyperlink w:history="1" w:anchor="_Toc12">
+            <w:r>
+              <w:t xml:space="preserve">4.5 Betriebsarten für Werbeinhalte (FA-20) — Split-Screen ist die Hauptbetriebsart</w:t>
+            </w:r>
+            <w:r>
+              <w:tab/>
+            </w:r>
+            <w:r>
+              <w:fldChar w:fldCharType="begin" w:dirty="true"/>
+              <w:instrText xml:space="preserve">PAGEREF _Toc12 \h</w:instrText>
+              <w:fldChar w:fldCharType="separate"/>
+              <w:fldChar w:fldCharType="end"/>
+            </w:r>
+          </w:hyperlink>
+        </w:p>
+        <w:p>
+          <w:pPr>
+            <w:pStyle w:val="TOC2"/>
+            <w:tabs>
+              <w:tab w:val="right" w:pos="9026" w:leader="dot"/>
+            </w:tabs>
+            <w:ind w:left="220"/>
+          </w:pPr>
+          <w:hyperlink w:history="1" w:anchor="_Toc13">
+            <w:r>
+              <w:t xml:space="preserve">4.6 Vorlagen bearbeiten: Arbeitskopie und explizites Speichern (FA-13)</w:t>
+            </w:r>
+            <w:r>
+              <w:tab/>
+            </w:r>
+            <w:r>
+              <w:fldChar w:fldCharType="begin" w:dirty="true"/>
+              <w:instrText xml:space="preserve">PAGEREF _Toc13 \h</w:instrText>
+              <w:fldChar w:fldCharType="separate"/>
+              <w:fldChar w:fldCharType="end"/>
+            </w:r>
+          </w:hyperlink>
+        </w:p>
+        <w:p>
+          <w:pPr>
+            <w:pStyle w:val="TOC2"/>
+            <w:tabs>
+              <w:tab w:val="right" w:pos="9026" w:leader="dot"/>
+            </w:tabs>
+            <w:ind w:left="220"/>
+          </w:pPr>
+          <w:hyperlink w:history="1" w:anchor="_Toc14">
+            <w:r>
+              <w:t xml:space="preserve">4.7 Ausgabedateien: Benennung, Ersetzen, Export (FA-22)</w:t>
+            </w:r>
+            <w:r>
+              <w:tab/>
+            </w:r>
+            <w:r>
+              <w:fldChar w:fldCharType="begin" w:dirty="true"/>
+              <w:instrText xml:space="preserve">PAGEREF _Toc14 \h</w:instrText>
+              <w:fldChar w:fldCharType="separate"/>
+              <w:fldChar w:fldCharType="end"/>
+            </w:r>
+          </w:hyperlink>
+        </w:p>
+        <w:p>
+          <w:pPr>
+            <w:pStyle w:val="TOC2"/>
+            <w:tabs>
+              <w:tab w:val="right" w:pos="9026" w:leader="dot"/>
+            </w:tabs>
+            <w:ind w:left="220"/>
+          </w:pPr>
+          <w:hyperlink w:history="1" w:anchor="_Toc15">
+            <w:r>
+              <w:t xml:space="preserve">4.8 Marken: Bestand, Ableitung, Zuweisung (FA-23, FA-24)</w:t>
+            </w:r>
+            <w:r>
+              <w:tab/>
+            </w:r>
+            <w:r>
+              <w:fldChar w:fldCharType="begin" w:dirty="true"/>
+              <w:instrText xml:space="preserve">PAGEREF _Toc15 \h</w:instrText>
+              <w:fldChar w:fldCharType="separate"/>
+              <w:fldChar w:fldCharType="end"/>
+            </w:r>
+          </w:hyperlink>
+        </w:p>
+        <w:p>
+          <w:pPr>
+            <w:pStyle w:val="TOC2"/>
+            <w:tabs>
+              <w:tab w:val="right" w:pos="9026" w:leader="dot"/>
+            </w:tabs>
+            <w:ind w:left="220"/>
+          </w:pPr>
+          <w:hyperlink w:history="1" w:anchor="_Toc16">
+            <w:r>
+              <w:t xml:space="preserve">4.9 Ein Projekt – ein Video (FA-01)</w:t>
+            </w:r>
+            <w:r>
+              <w:tab/>
+            </w:r>
+            <w:r>
+              <w:fldChar w:fldCharType="begin" w:dirty="true"/>
+              <w:instrText xml:space="preserve">PAGEREF _Toc16 \h</w:instrText>
+              <w:fldChar w:fldCharType="separate"/>
+              <w:fldChar w:fldCharType="end"/>
+            </w:r>
+          </w:hyperlink>
+        </w:p>
+        <w:p>
+          <w:pPr>
+            <w:pStyle w:val="TOC1"/>
+            <w:tabs>
+              <w:tab w:val="right" w:pos="9026" w:leader="dot"/>
+            </w:tabs>
+          </w:pPr>
+          <w:hyperlink w:history="1" w:anchor="_Toc17">
+            <w:r>
+              <w:t xml:space="preserve">5. Nicht-funktionale Anforderungen</w:t>
+            </w:r>
+            <w:r>
+              <w:tab/>
+            </w:r>
+            <w:r>
+              <w:fldChar w:fldCharType="begin" w:dirty="true"/>
+              <w:instrText xml:space="preserve">PAGEREF _Toc17 \h</w:instrText>
+              <w:fldChar w:fldCharType="separate"/>
+              <w:fldChar w:fldCharType="end"/>
+            </w:r>
+          </w:hyperlink>
+        </w:p>
+        <w:p>
+          <w:pPr>
+            <w:pStyle w:val="TOC1"/>
+            <w:tabs>
+              <w:tab w:val="right" w:pos="9026" w:leader="dot"/>
+            </w:tabs>
+          </w:pPr>
+          <w:hyperlink w:history="1" w:anchor="_Toc18">
+            <w:r>
+              <w:t xml:space="preserve">6. Technische Rahmenbedingungen (Vorschlag)</w:t>
+            </w:r>
+            <w:r>
+              <w:tab/>
+            </w:r>
+            <w:r>
+              <w:fldChar w:fldCharType="begin" w:dirty="true"/>
+              <w:instrText xml:space="preserve">PAGEREF _Toc18 \h</w:instrText>
+              <w:fldChar w:fldCharType="separate"/>
+              <w:fldChar w:fldCharType="end"/>
+            </w:r>
+          </w:hyperlink>
+        </w:p>
+        <w:p>
+          <w:pPr>
+            <w:pStyle w:val="TOC1"/>
+            <w:tabs>
+              <w:tab w:val="right" w:pos="9026" w:leader="dot"/>
+            </w:tabs>
+          </w:pPr>
+          <w:hyperlink w:history="1" w:anchor="_Toc19">
+            <w:r>
+              <w:t xml:space="preserve">7. Wiedergabe am Fernseher (Demo-Modus)</w:t>
+            </w:r>
+            <w:r>
+              <w:tab/>
+            </w:r>
+            <w:r>
+              <w:fldChar w:fldCharType="begin" w:dirty="true"/>
+              <w:instrText xml:space="preserve">PAGEREF _Toc19 \h</w:instrText>
+              <w:fldChar w:fldCharType="separate"/>
+              <w:fldChar w:fldCharType="end"/>
+            </w:r>
+          </w:hyperlink>
+        </w:p>
+        <w:p>
+          <w:pPr>
+            <w:pStyle w:val="TOC1"/>
+            <w:tabs>
+              <w:tab w:val="right" w:pos="9026" w:leader="dot"/>
+            </w:tabs>
+          </w:pPr>
+          <w:hyperlink w:history="1" w:anchor="_Toc20">
+            <w:r>
+              <w:t xml:space="preserve">8. Abgrenzung (Out of Scope)</w:t>
+            </w:r>
+            <w:r>
+              <w:tab/>
+            </w:r>
+            <w:r>
+              <w:fldChar w:fldCharType="begin" w:dirty="true"/>
+              <w:instrText xml:space="preserve">PAGEREF _Toc20 \h</w:instrText>
+              <w:fldChar w:fldCharType="separate"/>
+              <w:fldChar w:fldCharType="end"/>
+            </w:r>
+          </w:hyperlink>
+        </w:p>
+        <w:p>
+          <w:pPr>
+            <w:pStyle w:val="TOC1"/>
+            <w:tabs>
+              <w:tab w:val="right" w:pos="9026" w:leader="dot"/>
+            </w:tabs>
+          </w:pPr>
+          <w:hyperlink w:history="1" w:anchor="_Toc21">
+            <w:r>
+              <w:t xml:space="preserve">9. Annahmen</w:t>
+            </w:r>
+            <w:r>
+              <w:tab/>
+            </w:r>
+            <w:r>
+              <w:fldChar w:fldCharType="begin" w:dirty="true"/>
+              <w:instrText xml:space="preserve">PAGEREF _Toc21 \h</w:instrText>
+              <w:fldChar w:fldCharType="separate"/>
+              <w:fldChar w:fldCharType="end"/>
+            </w:r>
+          </w:hyperlink>
+        </w:p>
+        <w:p>
+          <w:pPr>
+            <w:pStyle w:val="TOC1"/>
+            <w:tabs>
+              <w:tab w:val="right" w:pos="9026" w:leader="dot"/>
+            </w:tabs>
+          </w:pPr>
+          <w:hyperlink w:history="1" w:anchor="_Toc22">
+            <w:r>
+              <w:t xml:space="preserve">10. Risiken und offene Punkte</w:t>
+            </w:r>
+            <w:r>
+              <w:tab/>
+            </w:r>
+            <w:r>
+              <w:fldChar w:fldCharType="begin" w:dirty="true"/>
+              <w:instrText xml:space="preserve">PAGEREF _Toc22 \h</w:instrText>
+              <w:fldChar w:fldCharType="separate"/>
+              <w:fldChar w:fldCharType="end"/>
+            </w:r>
+          </w:hyperlink>
+        </w:p>
+        <w:p>
+          <w:pPr>
+            <w:pStyle w:val="TOC1"/>
+            <w:tabs>
+              <w:tab w:val="right" w:pos="9026" w:leader="dot"/>
+            </w:tabs>
+          </w:pPr>
+          <w:hyperlink w:history="1" w:anchor="_Toc23">
+            <w:r>
+              <w:t xml:space="preserve">11. Ausbaustufen (Roadmap, optional)</w:t>
+            </w:r>
+            <w:r>
+              <w:tab/>
+            </w:r>
+            <w:r>
+              <w:fldChar w:fldCharType="begin" w:dirty="true"/>
+              <w:instrText xml:space="preserve">PAGEREF _Toc23 \h</w:instrText>
+              <w:fldChar w:fldCharType="separate"/>
+              <w:fldChar w:fldCharType="end"/>
+            </w:r>
+          </w:hyperlink>
+        </w:p>
+        <w:p>
+          <w:pPr>
+            <w:pStyle w:val="TOC1"/>
+            <w:tabs>
+              <w:tab w:val="right" w:pos="9026" w:leader="dot"/>
+            </w:tabs>
+          </w:pPr>
+          <w:hyperlink w:history="1" w:anchor="_Toc24">
+            <w:r>
+              <w:t xml:space="preserve">12. Akzeptanzkriterien</w:t>
+            </w:r>
+            <w:r>
+              <w:tab/>
+            </w:r>
+            <w:r>
+              <w:fldChar w:fldCharType="begin" w:dirty="true"/>
+              <w:instrText xml:space="preserve">PAGEREF _Toc24 \h</w:instrText>
+              <w:fldChar w:fldCharType="separate"/>
+              <w:fldChar w:fldCharType="end"/>
+            </w:r>
+          </w:hyperlink>
+        </w:p>
+        <w:p>
+          <w:pPr>
+            <w:pStyle w:val="TOC1"/>
+            <w:tabs>
+              <w:tab w:val="right" w:pos="9026" w:leader="dot"/>
+            </w:tabs>
+          </w:pPr>
+          <w:hyperlink w:history="1" w:anchor="_Toc25">
+            <w:r>
+              <w:t xml:space="preserve">13. Glossar</w:t>
+            </w:r>
+            <w:r>
+              <w:tab/>
+            </w:r>
+            <w:r>
+              <w:fldChar w:fldCharType="begin" w:dirty="true"/>
+              <w:instrText xml:space="preserve">PAGEREF _Toc25 \h</w:instrText>
+              <w:fldChar w:fldCharType="separate"/>
+              <w:fldChar w:fldCharType="end"/>
+            </w:r>
+          </w:hyperlink>
         </w:p>
         <w:p>
           <w:r>
@@ -260,6 +838,7 @@
       <w:pPr>
         <w:pStyle w:val="Heading1"/>
       </w:pPr>
+      <w:bookmarkStart w:name="_Toc1" w:id="1"/>
       <w:r>
         <w:rPr>
           <w:rFonts w:ascii="Arial" w:cs="Arial" w:eastAsia="Arial" w:hAnsi="Arial"/>
@@ -268,6 +847,7 @@
         </w:rPr>
         <w:t xml:space="preserve">1. Einleitung und Zielsetzung</w:t>
       </w:r>
+      <w:bookmarkEnd w:id="1"/>
     </w:p>
     <w:p>
       <w:pPr>
@@ -330,6 +910,7 @@
       <w:pPr>
         <w:pStyle w:val="Heading1"/>
       </w:pPr>
+      <w:bookmarkStart w:name="_Toc2" w:id="2"/>
       <w:r>
         <w:rPr>
           <w:rFonts w:ascii="Arial" w:cs="Arial" w:eastAsia="Arial" w:hAnsi="Arial"/>
@@ -338,11 +919,13 @@
         </w:rPr>
         <w:t xml:space="preserve">2. Ausgangslage und Rahmenbedingungen</w:t>
       </w:r>
+      <w:bookmarkEnd w:id="2"/>
     </w:p>
     <w:p>
       <w:pPr>
         <w:pStyle w:val="Heading2"/>
       </w:pPr>
+      <w:bookmarkStart w:name="_Toc3" w:id="3"/>
       <w:r>
         <w:rPr>
           <w:rFonts w:ascii="Arial" w:cs="Arial" w:eastAsia="Arial" w:hAnsi="Arial"/>
@@ -351,6 +934,7 @@
         </w:rPr>
         <w:t xml:space="preserve">2.1 Fachlicher Kontext</w:t>
       </w:r>
+      <w:bookmarkEnd w:id="3"/>
     </w:p>
     <w:p>
       <w:pPr>
@@ -450,6 +1034,7 @@
       <w:pPr>
         <w:pStyle w:val="Heading2"/>
       </w:pPr>
+      <w:bookmarkStart w:name="_Toc4" w:id="4"/>
       <w:r>
         <w:rPr>
           <w:rFonts w:ascii="Arial" w:cs="Arial" w:eastAsia="Arial" w:hAnsi="Arial"/>
@@ -458,6 +1043,7 @@
         </w:rPr>
         <w:t xml:space="preserve">2.2 Hardware-Umgebung (Wiedergabegerät)</w:t>
       </w:r>
+      <w:bookmarkEnd w:id="4"/>
     </w:p>
     <w:p>
       <w:pPr>
@@ -847,6 +1433,7 @@
       <w:pPr>
         <w:pStyle w:val="Heading2"/>
       </w:pPr>
+      <w:bookmarkStart w:name="_Toc5" w:id="5"/>
       <w:r>
         <w:rPr>
           <w:rFonts w:ascii="Arial" w:cs="Arial" w:eastAsia="Arial" w:hAnsi="Arial"/>
@@ -855,6 +1442,7 @@
         </w:rPr>
         <w:t xml:space="preserve">2.3 Organisatorische Rahmenbedingungen</w:t>
       </w:r>
+      <w:bookmarkEnd w:id="5"/>
     </w:p>
     <w:p>
       <w:pPr>
@@ -983,6 +1571,7 @@
       <w:pPr>
         <w:pStyle w:val="Heading1"/>
       </w:pPr>
+      <w:bookmarkStart w:name="_Toc6" w:id="6"/>
       <w:r>
         <w:rPr>
           <w:rFonts w:ascii="Arial" w:cs="Arial" w:eastAsia="Arial" w:hAnsi="Arial"/>
@@ -991,6 +1580,7 @@
         </w:rPr>
         <w:t xml:space="preserve">3. Systemüberblick / Lösungskonzept</w:t>
       </w:r>
+      <w:bookmarkEnd w:id="6"/>
     </w:p>
     <w:p>
       <w:pPr>
@@ -1141,6 +1731,7 @@
       <w:pPr>
         <w:pStyle w:val="Heading1"/>
       </w:pPr>
+      <w:bookmarkStart w:name="_Toc7" w:id="7"/>
       <w:r>
         <w:rPr>
           <w:rFonts w:ascii="Arial" w:cs="Arial" w:eastAsia="Arial" w:hAnsi="Arial"/>
@@ -1149,6 +1740,7 @@
         </w:rPr>
         <w:t xml:space="preserve">4. Funktionale Anforderungen</w:t>
       </w:r>
+      <w:bookmarkEnd w:id="7"/>
     </w:p>
     <w:p>
       <w:pPr>
@@ -1291,7 +1883,61 @@
                 <w:sz w:val="20"/>
                 <w:szCs w:val="20"/>
               </w:rPr>
-              <w:t xml:space="preserve">FA-01 | Video importieren | Ein oder mehrere bestehende Videos (mind. MP4) können in das Projekt importiert und in einer Liste verwaltet werden. | Muss</w:t>
+              <w:t xml:space="preserve">FA-01 | Video importieren | Ein Projekt enthält </w:t>
+            </w:r>
+            <w:r>
+              <w:rPr>
+                <w:rFonts w:ascii="Arial" w:cs="Arial" w:eastAsia="Arial" w:hAnsi="Arial"/>
+                <w:b/>
+                <w:bCs/>
+                <w:sz w:val="20"/>
+                <w:szCs w:val="20"/>
+              </w:rPr>
+              <w:t xml:space="preserve">genau ein</w:t>
+            </w:r>
+            <w:r>
+              <w:rPr>
+                <w:rFonts w:ascii="Arial" w:cs="Arial" w:eastAsia="Arial" w:hAnsi="Arial"/>
+                <w:sz w:val="20"/>
+                <w:szCs w:val="20"/>
+              </w:rPr>
+              <w:t xml:space="preserve"> Video (mind. MP4). Es wird beim Anlegen des Projekts oder im Projekt-Editor importiert und </w:t>
+            </w:r>
+            <w:r>
+              <w:rPr>
+                <w:rFonts w:ascii="Arial" w:cs="Arial" w:eastAsia="Arial" w:hAnsi="Arial"/>
+                <w:b/>
+                <w:bCs/>
+                <w:sz w:val="20"/>
+                <w:szCs w:val="20"/>
+              </w:rPr>
+              <w:t xml:space="preserve">automatisch ans Ende der Wiedergabeliste</w:t>
+            </w:r>
+            <w:r>
+              <w:rPr>
+                <w:rFonts w:ascii="Arial" w:cs="Arial" w:eastAsia="Arial" w:hAnsi="Arial"/>
+                <w:sz w:val="20"/>
+                <w:szCs w:val="20"/>
+              </w:rPr>
+              <w:t xml:space="preserve"> gestellt; ein erneuter Import </w:t>
+            </w:r>
+            <w:r>
+              <w:rPr>
+                <w:rFonts w:ascii="Arial" w:cs="Arial" w:eastAsia="Arial" w:hAnsi="Arial"/>
+                <w:b/>
+                <w:bCs/>
+                <w:sz w:val="20"/>
+                <w:szCs w:val="20"/>
+              </w:rPr>
+              <w:t xml:space="preserve">ersetzt</w:t>
+            </w:r>
+            <w:r>
+              <w:rPr>
+                <w:rFonts w:ascii="Arial" w:cs="Arial" w:eastAsia="Arial" w:hAnsi="Arial"/>
+                <w:sz w:val="20"/>
+                <w:szCs w:val="20"/>
+              </w:rPr>
+              <w:t xml:space="preserve"> es nach Bestätigung. Details: 4.9. | Muss</w:t>
             </w:r>
           </w:p>
         </w:tc>
@@ -1349,7 +1995,25 @@
                 <w:sz w:val="20"/>
                 <w:szCs w:val="20"/>
               </w:rPr>
-              <w:t xml:space="preserve">FA-03 | Inhalte bearbeiten/löschen | Vorhandene Videos und Produkte/Aktionen können bearbeitet und entfernt werden. | Muss</w:t>
+              <w:t xml:space="preserve">FA-03 | Inhalte bearbeiten/löschen | Das importierte Video sowie Produkte/Aktionen können bearbeitet und entfernt werden; das Video wird über einen erneuten Import </w:t>
+            </w:r>
+            <w:r>
+              <w:rPr>
+                <w:rFonts w:ascii="Arial" w:cs="Arial" w:eastAsia="Arial" w:hAnsi="Arial"/>
+                <w:b/>
+                <w:bCs/>
+                <w:sz w:val="20"/>
+                <w:szCs w:val="20"/>
+              </w:rPr>
+              <w:t xml:space="preserve">ersetzt</w:t>
+            </w:r>
+            <w:r>
+              <w:rPr>
+                <w:rFonts w:ascii="Arial" w:cs="Arial" w:eastAsia="Arial" w:hAnsi="Arial"/>
+                <w:sz w:val="20"/>
+                <w:szCs w:val="20"/>
+              </w:rPr>
+              <w:t xml:space="preserve"> (4.9). | Muss</w:t>
             </w:r>
           </w:p>
         </w:tc>
@@ -1407,7 +2071,7 @@
                 <w:sz w:val="20"/>
                 <w:szCs w:val="20"/>
               </w:rPr>
-              <w:t xml:space="preserve">FA-05 | Reihenfolge festlegen | Alle Elemente (Videos + Aktions-Segmente) können zu einer Wiedergabeliste zusammengestellt und in der Reihenfolge angeordnet werden (z. B. per Drag-and-drop). | Muss</w:t>
+              <w:t xml:space="preserve">FA-05 | Reihenfolge festlegen | Das Video und die Aktions-Segmente können zu einer Wiedergabeliste zusammengestellt und in der Reihenfolge angeordnet werden (z. B. per Drag-and-drop). | Muss</w:t>
             </w:r>
           </w:p>
         </w:tc>
@@ -3136,6 +3800,7 @@
       <w:pPr>
         <w:pStyle w:val="Heading2"/>
       </w:pPr>
+      <w:bookmarkStart w:name="_Toc8" w:id="8"/>
       <w:r>
         <w:rPr>
           <w:rFonts w:ascii="Arial" w:cs="Arial" w:eastAsia="Arial" w:hAnsi="Arial"/>
@@ -3144,6 +3809,7 @@
         </w:rPr>
         <w:t xml:space="preserve">4.1 Gestaltung der Aktions-Segmente (Corporate Design)</w:t>
       </w:r>
+      <w:bookmarkEnd w:id="8"/>
     </w:p>
     <w:p>
       <w:pPr>
@@ -3364,6 +4030,7 @@
       <w:pPr>
         <w:pStyle w:val="Heading2"/>
       </w:pPr>
+      <w:bookmarkStart w:name="_Toc9" w:id="9"/>
       <w:r>
         <w:rPr>
           <w:rFonts w:ascii="Arial" w:cs="Arial" w:eastAsia="Arial" w:hAnsi="Arial"/>
@@ -3372,6 +4039,7 @@
         </w:rPr>
         <w:t xml:space="preserve">4.2 Design-Tokens / Style-Guide</w:t>
       </w:r>
+      <w:bookmarkEnd w:id="9"/>
     </w:p>
     <w:p>
       <w:pPr>
@@ -4534,6 +5202,7 @@
       <w:pPr>
         <w:pStyle w:val="Heading2"/>
       </w:pPr>
+      <w:bookmarkStart w:name="_Toc10" w:id="10"/>
       <w:r>
         <w:rPr>
           <w:rFonts w:ascii="Arial" w:cs="Arial" w:eastAsia="Arial" w:hAnsi="Arial"/>
@@ -4542,6 +5211,7 @@
         </w:rPr>
         <w:t xml:space="preserve">4.3 Prozessverwaltung (Auftrags-Queue)</w:t>
       </w:r>
+      <w:bookmarkEnd w:id="10"/>
     </w:p>
     <w:p>
       <w:pPr>
@@ -4816,6 +5486,7 @@
       <w:pPr>
         <w:pStyle w:val="Heading2"/>
       </w:pPr>
+      <w:bookmarkStart w:name="_Toc11" w:id="11"/>
       <w:r>
         <w:rPr>
           <w:rFonts w:ascii="Arial" w:cs="Arial" w:eastAsia="Arial" w:hAnsi="Arial"/>
@@ -4824,6 +5495,7 @@
         </w:rPr>
         <w:t xml:space="preserve">4.4 Dauer und Trim – einheitliche Bedienung</w:t>
       </w:r>
+      <w:bookmarkEnd w:id="11"/>
     </w:p>
     <w:p>
       <w:pPr>
@@ -5817,6 +6489,7 @@
       <w:pPr>
         <w:pStyle w:val="Heading2"/>
       </w:pPr>
+      <w:bookmarkStart w:name="_Toc12" w:id="12"/>
       <w:r>
         <w:rPr>
           <w:rFonts w:ascii="Arial" w:cs="Arial" w:eastAsia="Arial" w:hAnsi="Arial"/>
@@ -5825,6 +6498,7 @@
         </w:rPr>
         <w:t xml:space="preserve">4.5 Betriebsarten für Werbeinhalte (FA-20) — Split-Screen ist die Hauptbetriebsart</w:t>
       </w:r>
+      <w:bookmarkEnd w:id="12"/>
     </w:p>
     <w:p>
       <w:pPr>
@@ -6366,6 +7040,7 @@
       <w:pPr>
         <w:pStyle w:val="Heading2"/>
       </w:pPr>
+      <w:bookmarkStart w:name="_Toc13" w:id="13"/>
       <w:r>
         <w:rPr>
           <w:rFonts w:ascii="Arial" w:cs="Arial" w:eastAsia="Arial" w:hAnsi="Arial"/>
@@ -6374,6 +7049,7 @@
         </w:rPr>
         <w:t xml:space="preserve">4.6 Vorlagen bearbeiten: Arbeitskopie und explizites Speichern (FA-13)</w:t>
       </w:r>
+      <w:bookmarkEnd w:id="13"/>
     </w:p>
     <w:p>
       <w:pPr>
@@ -6694,6 +7370,7 @@
       <w:pPr>
         <w:pStyle w:val="Heading2"/>
       </w:pPr>
+      <w:bookmarkStart w:name="_Toc14" w:id="14"/>
       <w:r>
         <w:rPr>
           <w:rFonts w:ascii="Arial" w:cs="Arial" w:eastAsia="Arial" w:hAnsi="Arial"/>
@@ -6702,6 +7379,7 @@
         </w:rPr>
         <w:t xml:space="preserve">4.7 Ausgabedateien: Benennung, Ersetzen, Export (FA-22)</w:t>
       </w:r>
+      <w:bookmarkEnd w:id="14"/>
     </w:p>
     <w:p>
       <w:pPr>
@@ -7102,6 +7780,7 @@
       <w:pPr>
         <w:pStyle w:val="Heading2"/>
       </w:pPr>
+      <w:bookmarkStart w:name="_Toc15" w:id="15"/>
       <w:r>
         <w:rPr>
           <w:rFonts w:ascii="Arial" w:cs="Arial" w:eastAsia="Arial" w:hAnsi="Arial"/>
@@ -7110,6 +7789,7 @@
         </w:rPr>
         <w:t xml:space="preserve">4.8 Marken: Bestand, Ableitung, Zuweisung (FA-23, FA-24)</w:t>
       </w:r>
+      <w:bookmarkEnd w:id="15"/>
     </w:p>
     <w:p>
       <w:pPr>
@@ -8190,8 +8870,446 @@
     </w:p>
     <w:p>
       <w:pPr>
+        <w:pStyle w:val="Heading2"/>
+      </w:pPr>
+      <w:bookmarkStart w:name="_Toc16" w:id="16"/>
+      <w:r>
+        <w:rPr>
+          <w:rFonts w:ascii="Arial" w:cs="Arial" w:eastAsia="Arial" w:hAnsi="Arial"/>
+          <w:sz w:val="20"/>
+          <w:szCs w:val="20"/>
+        </w:rPr>
+        <w:t xml:space="preserve">4.9 Ein Projekt – ein Video (FA-01)</w:t>
+      </w:r>
+      <w:bookmarkEnd w:id="16"/>
+    </w:p>
+    <w:p>
+      <w:pPr>
+        <w:spacing w:after="120"/>
+      </w:pPr>
+      <w:r>
+        <w:rPr>
+          <w:rFonts w:ascii="Arial" w:cs="Arial" w:eastAsia="Arial" w:hAnsi="Arial"/>
+          <w:sz w:val="20"/>
+          <w:szCs w:val="20"/>
+        </w:rPr>
+        <w:t xml:space="preserve">Ein Projekt enthält </w:t>
+      </w:r>
+      <w:r>
+        <w:rPr>
+          <w:rFonts w:ascii="Arial" w:cs="Arial" w:eastAsia="Arial" w:hAnsi="Arial"/>
+          <w:b/>
+          <w:bCs/>
+          <w:sz w:val="20"/>
+          <w:szCs w:val="20"/>
+        </w:rPr>
+        <w:t xml:space="preserve">genau ein Video</w:t>
+      </w:r>
+      <w:r>
+        <w:rPr>
+          <w:rFonts w:ascii="Arial" w:cs="Arial" w:eastAsia="Arial" w:hAnsi="Arial"/>
+          <w:sz w:val="20"/>
+          <w:szCs w:val="20"/>
+        </w:rPr>
+        <w:t xml:space="preserve"> neben </w:t>
+      </w:r>
+      <w:r>
+        <w:rPr>
+          <w:rFonts w:ascii="Arial" w:cs="Arial" w:eastAsia="Arial" w:hAnsi="Arial"/>
+          <w:b/>
+          <w:bCs/>
+          <w:sz w:val="20"/>
+          <w:szCs w:val="20"/>
+        </w:rPr>
+        <w:t xml:space="preserve">beliebig vielen Aktions-Segmenten</w:t>
+      </w:r>
+      <w:r>
+        <w:rPr>
+          <w:rFonts w:ascii="Arial" w:cs="Arial" w:eastAsia="Arial" w:hAnsi="Arial"/>
+          <w:sz w:val="20"/>
+          <w:szCs w:val="20"/>
+        </w:rPr>
+        <w:t xml:space="preserve">. Das Video ist der</w:t>
+      </w:r>
+    </w:p>
+    <w:p>
+      <w:pPr>
+        <w:spacing w:after="120"/>
+      </w:pPr>
+      <w:r>
+        <w:rPr>
+          <w:rFonts w:ascii="Arial" w:cs="Arial" w:eastAsia="Arial" w:hAnsi="Arial"/>
+          <w:sz w:val="20"/>
+          <w:szCs w:val="20"/>
+        </w:rPr>
+        <w:t xml:space="preserve">Hauptinhalt; die Werbung läuft sequenziell zwischen den Elementen oder parallel zum Video (4.5, FA-20).</w:t>
+      </w:r>
+    </w:p>
+    <w:p>
+      <w:pPr>
+        <w:spacing w:after="120"/>
+      </w:pPr>
+      <w:r>
+        <w:rPr>
+          <w:rFonts w:ascii="Arial" w:cs="Arial" w:eastAsia="Arial" w:hAnsi="Arial"/>
+          <w:sz w:val="20"/>
+          <w:szCs w:val="20"/>
+        </w:rPr>
+        <w:t xml:space="preserve">Das ist die Grundannahme des Werkzeugs: gepflegt wird </w:t>
+      </w:r>
+      <w:r>
+        <w:rPr>
+          <w:rFonts w:ascii="Arial" w:cs="Arial" w:eastAsia="Arial" w:hAnsi="Arial"/>
+          <w:b/>
+          <w:bCs/>
+          <w:sz w:val="20"/>
+          <w:szCs w:val="20"/>
+        </w:rPr>
+        <w:t xml:space="preserve">ein</w:t>
+      </w:r>
+      <w:r>
+        <w:rPr>
+          <w:rFonts w:ascii="Arial" w:cs="Arial" w:eastAsia="Arial" w:hAnsi="Arial"/>
+          <w:sz w:val="20"/>
+          <w:szCs w:val="20"/>
+        </w:rPr>
+        <w:t xml:space="preserve"> Hauptvideo, dazu die wechselnde Werbung.</w:t>
+      </w:r>
+    </w:p>
+    <w:p>
+      <w:pPr>
+        <w:pStyle w:val="ListParagraph"/>
+        <w:numPr>
+          <w:ilvl w:val="0"/>
+          <w:numId w:val="2"/>
+        </w:numPr>
+      </w:pPr>
+      <w:r>
+        <w:rPr>
+          <w:rFonts w:ascii="Arial" w:cs="Arial" w:eastAsia="Arial" w:hAnsi="Arial"/>
+          <w:b/>
+          <w:bCs/>
+          <w:sz w:val="20"/>
+          <w:szCs w:val="20"/>
+        </w:rPr>
+        <w:t xml:space="preserve">Import beim Anlegen.</w:t>
+      </w:r>
+      <w:r>
+        <w:rPr>
+          <w:rFonts w:ascii="Arial" w:cs="Arial" w:eastAsia="Arial" w:hAnsi="Arial"/>
+          <w:sz w:val="20"/>
+          <w:szCs w:val="20"/>
+        </w:rPr>
+        <w:t xml:space="preserve"> Ein neues Projekt kann sein Video bereits beim </w:t>
+      </w:r>
+      <w:r>
+        <w:rPr>
+          <w:rFonts w:ascii="Arial" w:cs="Arial" w:eastAsia="Arial" w:hAnsi="Arial"/>
+          <w:b/>
+          <w:bCs/>
+          <w:sz w:val="20"/>
+          <w:szCs w:val="20"/>
+        </w:rPr>
+        <w:t xml:space="preserve">Anlegen</w:t>
+      </w:r>
+      <w:r>
+        <w:rPr>
+          <w:rFonts w:ascii="Arial" w:cs="Arial" w:eastAsia="Arial" w:hAnsi="Arial"/>
+          <w:sz w:val="20"/>
+          <w:szCs w:val="20"/>
+        </w:rPr>
+        <w:t xml:space="preserve"> erhalten (Name +</w:t>
+      </w:r>
+    </w:p>
+    <w:p>
+      <w:pPr>
+        <w:spacing w:after="120"/>
+      </w:pPr>
+      <w:r>
+        <w:rPr>
+          <w:rFonts w:ascii="Arial" w:cs="Arial" w:eastAsia="Arial" w:hAnsi="Arial"/>
+          <w:sz w:val="20"/>
+          <w:szCs w:val="20"/>
+        </w:rPr>
+        <w:t xml:space="preserve">„Video importieren", FA-10). Das importierte Video wird </w:t>
+      </w:r>
+      <w:r>
+        <w:rPr>
+          <w:rFonts w:ascii="Arial" w:cs="Arial" w:eastAsia="Arial" w:hAnsi="Arial"/>
+          <w:b/>
+          <w:bCs/>
+          <w:sz w:val="20"/>
+          <w:szCs w:val="20"/>
+        </w:rPr>
+        <w:t xml:space="preserve">automatisch ans Ende der Wiedergabeliste</w:t>
+      </w:r>
+    </w:p>
+    <w:p>
+      <w:pPr>
+        <w:spacing w:after="120"/>
+      </w:pPr>
+      <w:r>
+        <w:rPr>
+          <w:rFonts w:ascii="Arial" w:cs="Arial" w:eastAsia="Arial" w:hAnsi="Arial"/>
+          <w:sz w:val="20"/>
+          <w:szCs w:val="20"/>
+        </w:rPr>
+        <w:t xml:space="preserve">gestellt – es ist sofort Inhalt, ohne einen zweiten Bedienschritt.</w:t>
+      </w:r>
+    </w:p>
+    <w:p>
+      <w:pPr>
+        <w:pStyle w:val="ListParagraph"/>
+        <w:numPr>
+          <w:ilvl w:val="0"/>
+          <w:numId w:val="2"/>
+        </w:numPr>
+      </w:pPr>
+      <w:r>
+        <w:rPr>
+          <w:rFonts w:ascii="Arial" w:cs="Arial" w:eastAsia="Arial" w:hAnsi="Arial"/>
+          <w:b/>
+          <w:bCs/>
+          <w:sz w:val="20"/>
+          <w:szCs w:val="20"/>
+        </w:rPr>
+        <w:t xml:space="preserve">Import im Projekt.</w:t>
+      </w:r>
+      <w:r>
+        <w:rPr>
+          <w:rFonts w:ascii="Arial" w:cs="Arial" w:eastAsia="Arial" w:hAnsi="Arial"/>
+          <w:sz w:val="20"/>
+          <w:szCs w:val="20"/>
+        </w:rPr>
+        <w:t xml:space="preserve"> Im Projekt-Editor (Reiter [Zusammenstellen]) heißt der Weg </w:t>
+      </w:r>
+      <w:r>
+        <w:rPr>
+          <w:rFonts w:ascii="Arial" w:cs="Arial" w:eastAsia="Arial" w:hAnsi="Arial"/>
+          <w:b/>
+          <w:bCs/>
+          <w:sz w:val="20"/>
+          <w:szCs w:val="20"/>
+        </w:rPr>
+        <w:t xml:space="preserve">„Video importieren"</w:t>
+      </w:r>
+      <w:r>
+        <w:rPr>
+          <w:rFonts w:ascii="Arial" w:cs="Arial" w:eastAsia="Arial" w:hAnsi="Arial"/>
+          <w:sz w:val="20"/>
+          <w:szCs w:val="20"/>
+        </w:rPr>
+        <w:t xml:space="preserve">.</w:t>
+      </w:r>
+    </w:p>
+    <w:p>
+      <w:pPr>
+        <w:pStyle w:val="ListParagraph"/>
+        <w:numPr>
+          <w:ilvl w:val="0"/>
+          <w:numId w:val="2"/>
+        </w:numPr>
+      </w:pPr>
+      <w:r>
+        <w:rPr>
+          <w:rFonts w:ascii="Arial" w:cs="Arial" w:eastAsia="Arial" w:hAnsi="Arial"/>
+          <w:b/>
+          <w:bCs/>
+          <w:sz w:val="20"/>
+          <w:szCs w:val="20"/>
+        </w:rPr>
+        <w:t xml:space="preserve">Ersetzen statt Wechseln.</w:t>
+      </w:r>
+      <w:r>
+        <w:rPr>
+          <w:rFonts w:ascii="Arial" w:cs="Arial" w:eastAsia="Arial" w:hAnsi="Arial"/>
+          <w:sz w:val="20"/>
+          <w:szCs w:val="20"/>
+        </w:rPr>
+        <w:t xml:space="preserve"> Liegt schon ein Video vor, </w:t>
+      </w:r>
+      <w:r>
+        <w:rPr>
+          <w:rFonts w:ascii="Arial" w:cs="Arial" w:eastAsia="Arial" w:hAnsi="Arial"/>
+          <w:b/>
+          <w:bCs/>
+          <w:sz w:val="20"/>
+          <w:szCs w:val="20"/>
+        </w:rPr>
+        <w:t xml:space="preserve">ersetzt</w:t>
+      </w:r>
+      <w:r>
+        <w:rPr>
+          <w:rFonts w:ascii="Arial" w:cs="Arial" w:eastAsia="Arial" w:hAnsi="Arial"/>
+          <w:sz w:val="20"/>
+          <w:szCs w:val="20"/>
+        </w:rPr>
+        <w:t xml:space="preserve"> ein erneuter Import es – nach einer</w:t>
+      </w:r>
+    </w:p>
+    <w:p>
+      <w:pPr>
+        <w:spacing w:after="120"/>
+      </w:pPr>
+      <w:r>
+        <w:rPr>
+          <w:rFonts w:ascii="Arial" w:cs="Arial" w:eastAsia="Arial" w:hAnsi="Arial"/>
+          <w:b/>
+          <w:bCs/>
+          <w:sz w:val="20"/>
+          <w:szCs w:val="20"/>
+        </w:rPr>
+        <w:t xml:space="preserve">Bestätigung</w:t>
+      </w:r>
+      <w:r>
+        <w:rPr>
+          <w:rFonts w:ascii="Arial" w:cs="Arial" w:eastAsia="Arial" w:hAnsi="Arial"/>
+          <w:sz w:val="20"/>
+          <w:szCs w:val="20"/>
+        </w:rPr>
+        <w:t xml:space="preserve">. Es gibt </w:t>
+      </w:r>
+      <w:r>
+        <w:rPr>
+          <w:rFonts w:ascii="Arial" w:cs="Arial" w:eastAsia="Arial" w:hAnsi="Arial"/>
+          <w:b/>
+          <w:bCs/>
+          <w:sz w:val="20"/>
+          <w:szCs w:val="20"/>
+        </w:rPr>
+        <w:t xml:space="preserve">keine</w:t>
+      </w:r>
+      <w:r>
+        <w:rPr>
+          <w:rFonts w:ascii="Arial" w:cs="Arial" w:eastAsia="Arial" w:hAnsi="Arial"/>
+          <w:sz w:val="20"/>
+          <w:szCs w:val="20"/>
+        </w:rPr>
+        <w:t xml:space="preserve"> Auswahl unter mehreren Videos und keinen beiläufigen „Video</w:t>
+      </w:r>
+    </w:p>
+    <w:p>
+      <w:pPr>
+        <w:spacing w:after="120"/>
+      </w:pPr>
+      <w:r>
+        <w:rPr>
+          <w:rFonts w:ascii="Arial" w:cs="Arial" w:eastAsia="Arial" w:hAnsi="Arial"/>
+          <w:sz w:val="20"/>
+          <w:szCs w:val="20"/>
+        </w:rPr>
+        <w:t xml:space="preserve">austauschen"-Schalter: Ein Projekt hat genau eines. Der Import hat Dateiwirkung und ist </w:t>
+      </w:r>
+      <w:r>
+        <w:rPr>
+          <w:rFonts w:ascii="Arial" w:cs="Arial" w:eastAsia="Arial" w:hAnsi="Arial"/>
+          <w:b/>
+          <w:bCs/>
+          <w:sz w:val="20"/>
+          <w:szCs w:val="20"/>
+        </w:rPr>
+        <w:t xml:space="preserve">nicht</w:t>
+      </w:r>
+    </w:p>
+    <w:p>
+      <w:pPr>
+        <w:spacing w:after="120"/>
+      </w:pPr>
+      <w:r>
+        <w:rPr>
+          <w:rFonts w:ascii="Arial" w:cs="Arial" w:eastAsia="Arial" w:hAnsi="Arial"/>
+          <w:sz w:val="20"/>
+          <w:szCs w:val="20"/>
+        </w:rPr>
+        <w:t xml:space="preserve">rückgängig zu machen (FA-21) – deshalb die Bestätigung.</w:t>
+      </w:r>
+    </w:p>
+    <w:p>
+      <w:pPr>
+        <w:pStyle w:val="ListParagraph"/>
+        <w:numPr>
+          <w:ilvl w:val="0"/>
+          <w:numId w:val="2"/>
+        </w:numPr>
+      </w:pPr>
+      <w:r>
+        <w:rPr>
+          <w:rFonts w:ascii="Arial" w:cs="Arial" w:eastAsia="Arial" w:hAnsi="Arial"/>
+          <w:b/>
+          <w:bCs/>
+          <w:sz w:val="20"/>
+          <w:szCs w:val="20"/>
+        </w:rPr>
+        <w:t xml:space="preserve">Kein zweites Video.</w:t>
+      </w:r>
+      <w:r>
+        <w:rPr>
+          <w:rFonts w:ascii="Arial" w:cs="Arial" w:eastAsia="Arial" w:hAnsi="Arial"/>
+          <w:sz w:val="20"/>
+          <w:szCs w:val="20"/>
+        </w:rPr>
+        <w:t xml:space="preserve"> Es gibt </w:t>
+      </w:r>
+      <w:r>
+        <w:rPr>
+          <w:rFonts w:ascii="Arial" w:cs="Arial" w:eastAsia="Arial" w:hAnsi="Arial"/>
+          <w:b/>
+          <w:bCs/>
+          <w:sz w:val="20"/>
+          <w:szCs w:val="20"/>
+        </w:rPr>
+        <w:t xml:space="preserve">keinen</w:t>
+      </w:r>
+      <w:r>
+        <w:rPr>
+          <w:rFonts w:ascii="Arial" w:cs="Arial" w:eastAsia="Arial" w:hAnsi="Arial"/>
+          <w:sz w:val="20"/>
+          <w:szCs w:val="20"/>
+        </w:rPr>
+        <w:t xml:space="preserve"> Bedienweg, ein zweites Video neben dem vorhandenen in die</w:t>
+      </w:r>
+    </w:p>
+    <w:p>
+      <w:pPr>
+        <w:spacing w:after="120"/>
+      </w:pPr>
+      <w:r>
+        <w:rPr>
+          <w:rFonts w:ascii="Arial" w:cs="Arial" w:eastAsia="Arial" w:hAnsi="Arial"/>
+          <w:sz w:val="20"/>
+          <w:szCs w:val="20"/>
+        </w:rPr>
+        <w:t xml:space="preserve">Wiedergabeliste zu legen. Bilder bleiben möglich – aber ausschließlich als </w:t>
+      </w:r>
+      <w:r>
+        <w:rPr>
+          <w:rFonts w:ascii="Arial" w:cs="Arial" w:eastAsia="Arial" w:hAnsi="Arial"/>
+          <w:b/>
+          <w:bCs/>
+          <w:sz w:val="20"/>
+          <w:szCs w:val="20"/>
+        </w:rPr>
+        <w:t xml:space="preserve">Motiv einer Aktion</w:t>
+      </w:r>
+    </w:p>
+    <w:p>
+      <w:pPr>
+        <w:spacing w:after="120"/>
+      </w:pPr>
+      <w:r>
+        <w:rPr>
+          <w:rFonts w:ascii="Arial" w:cs="Arial" w:eastAsia="Arial" w:hAnsi="Arial"/>
+          <w:sz w:val="20"/>
+          <w:szCs w:val="20"/>
+        </w:rPr>
+        <w:t xml:space="preserve">(4.1), nie als eigenes Listenelement.</w:t>
+      </w:r>
+    </w:p>
+    <w:p>
+      <w:pPr>
         <w:pStyle w:val="Heading1"/>
       </w:pPr>
+      <w:bookmarkStart w:name="_Toc17" w:id="17"/>
       <w:r>
         <w:rPr>
           <w:rFonts w:ascii="Arial" w:cs="Arial" w:eastAsia="Arial" w:hAnsi="Arial"/>
@@ -8200,6 +9318,7 @@
         </w:rPr>
         <w:t xml:space="preserve">5. Nicht-funktionale Anforderungen</w:t>
       </w:r>
+      <w:bookmarkEnd w:id="17"/>
     </w:p>
     <w:tbl>
       <w:tblPr>
@@ -8557,6 +9676,7 @@
       <w:pPr>
         <w:pStyle w:val="Heading1"/>
       </w:pPr>
+      <w:bookmarkStart w:name="_Toc18" w:id="18"/>
       <w:r>
         <w:rPr>
           <w:rFonts w:ascii="Arial" w:cs="Arial" w:eastAsia="Arial" w:hAnsi="Arial"/>
@@ -8565,6 +9685,7 @@
         </w:rPr>
         <w:t xml:space="preserve">6. Technische Rahmenbedingungen (Vorschlag)</w:t>
       </w:r>
+      <w:bookmarkEnd w:id="18"/>
     </w:p>
     <w:p>
       <w:pPr>
@@ -8831,6 +9952,7 @@
       <w:pPr>
         <w:pStyle w:val="Heading1"/>
       </w:pPr>
+      <w:bookmarkStart w:name="_Toc19" w:id="19"/>
       <w:r>
         <w:rPr>
           <w:rFonts w:ascii="Arial" w:cs="Arial" w:eastAsia="Arial" w:hAnsi="Arial"/>
@@ -8839,6 +9961,7 @@
         </w:rPr>
         <w:t xml:space="preserve">7. Wiedergabe am Fernseher (Demo-Modus)</w:t>
       </w:r>
+      <w:bookmarkEnd w:id="19"/>
     </w:p>
     <w:p>
       <w:pPr>
@@ -9109,6 +10232,7 @@
       <w:pPr>
         <w:pStyle w:val="Heading1"/>
       </w:pPr>
+      <w:bookmarkStart w:name="_Toc20" w:id="20"/>
       <w:r>
         <w:rPr>
           <w:rFonts w:ascii="Arial" w:cs="Arial" w:eastAsia="Arial" w:hAnsi="Arial"/>
@@ -9117,6 +10241,7 @@
         </w:rPr>
         <w:t xml:space="preserve">8. Abgrenzung (Out of Scope)</w:t>
       </w:r>
+      <w:bookmarkEnd w:id="20"/>
     </w:p>
     <w:p>
       <w:pPr>
@@ -9255,6 +10380,7 @@
       <w:pPr>
         <w:pStyle w:val="Heading1"/>
       </w:pPr>
+      <w:bookmarkStart w:name="_Toc21" w:id="21"/>
       <w:r>
         <w:rPr>
           <w:rFonts w:ascii="Arial" w:cs="Arial" w:eastAsia="Arial" w:hAnsi="Arial"/>
@@ -9263,6 +10389,7 @@
         </w:rPr>
         <w:t xml:space="preserve">9. Annahmen</w:t>
       </w:r>
+      <w:bookmarkEnd w:id="21"/>
     </w:p>
     <w:p>
       <w:pPr>
@@ -9372,6 +10499,7 @@
       <w:pPr>
         <w:pStyle w:val="Heading1"/>
       </w:pPr>
+      <w:bookmarkStart w:name="_Toc22" w:id="22"/>
       <w:r>
         <w:rPr>
           <w:rFonts w:ascii="Arial" w:cs="Arial" w:eastAsia="Arial" w:hAnsi="Arial"/>
@@ -9380,6 +10508,7 @@
         </w:rPr>
         <w:t xml:space="preserve">10. Risiken und offene Punkte</w:t>
       </w:r>
+      <w:bookmarkEnd w:id="22"/>
     </w:p>
     <w:tbl>
       <w:tblPr>
@@ -9817,6 +10946,7 @@
       <w:pPr>
         <w:pStyle w:val="Heading1"/>
       </w:pPr>
+      <w:bookmarkStart w:name="_Toc23" w:id="23"/>
       <w:r>
         <w:rPr>
           <w:rFonts w:ascii="Arial" w:cs="Arial" w:eastAsia="Arial" w:hAnsi="Arial"/>
@@ -9825,6 +10955,7 @@
         </w:rPr>
         <w:t xml:space="preserve">11. Ausbaustufen (Roadmap, optional)</w:t>
       </w:r>
+      <w:bookmarkEnd w:id="23"/>
     </w:p>
     <w:p>
       <w:pPr>
@@ -9924,6 +11055,7 @@
       <w:pPr>
         <w:pStyle w:val="Heading1"/>
       </w:pPr>
+      <w:bookmarkStart w:name="_Toc24" w:id="24"/>
       <w:r>
         <w:rPr>
           <w:rFonts w:ascii="Arial" w:cs="Arial" w:eastAsia="Arial" w:hAnsi="Arial"/>
@@ -9932,6 +11064,7 @@
         </w:rPr>
         <w:t xml:space="preserve">12. Akzeptanzkriterien</w:t>
       </w:r>
+      <w:bookmarkEnd w:id="24"/>
     </w:p>
     <w:p>
       <w:pPr>
@@ -9960,7 +11093,7 @@
           <w:sz w:val="20"/>
           <w:szCs w:val="20"/>
         </w:rPr>
-        <w:t xml:space="preserve">Videos sowie Produkte/Aktionen über die Oberfläche angelegt, bearbeitet, gelöscht und in der Reihenfolge angeordnet werden können (FA-01 bis FA-05).</w:t>
+        <w:t xml:space="preserve">Ein Video sowie Produkte/Aktionen über die Oberfläche importiert/angelegt, bearbeitet, gelöscht und in der Reihenfolge angeordnet werden können (FA-01 bis FA-05).</w:t>
       </w:r>
     </w:p>
     <w:p>
@@ -10156,6 +11289,7 @@
       <w:pPr>
         <w:pStyle w:val="Heading1"/>
       </w:pPr>
+      <w:bookmarkStart w:name="_Toc25" w:id="25"/>
       <w:r>
         <w:rPr>
           <w:rFonts w:ascii="Arial" w:cs="Arial" w:eastAsia="Arial" w:hAnsi="Arial"/>
@@ -10164,6 +11298,7 @@
         </w:rPr>
         <w:t xml:space="preserve">13. Glossar</w:t>
       </w:r>
+      <w:bookmarkEnd w:id="25"/>
     </w:p>
     <w:p>
       <w:pPr>
@@ -10499,10 +11634,6 @@
 </w:document>
 </file>
 
-<file path=word/comments.xml><?xml version="1.0" encoding="utf-8"?>
-<w:comments xmlns:cx="http://schemas.microsoft.com/office/drawing/2014/chartex" xmlns:cx1="http://schemas.microsoft.com/office/drawing/2015/9/8/chartex" xmlns:cx2="http://schemas.microsoft.com/office/drawing/2015/10/21/chartex" xmlns:cx3="http://schemas.microsoft.com/office/drawing/2016/5/9/chartex" xmlns:cx4="http://schemas.microsoft.com/office/drawing/2016/5/10/chartex" xmlns:cx5="http://schemas.microsoft.com/office/drawing/2016/5/11/chartex" xmlns:cx6="http://schemas.microsoft.com/office/drawing/2016/5/12/chartex" xmlns:cx7="http://schemas.microsoft.com/office/drawing/2016/5/13/chartex" xmlns:cx8="http://schemas.microsoft.com/office/drawing/2016/5/14/chartex" xmlns:mc="http://schemas.openxmlformats.org/markup-compatibility/2006" xmlns:aink="http://schemas.microsoft.com/office/drawing/2016/ink" xmlns:am3d="http://schemas.microsoft.com/office/drawing/2017/model3d" xmlns:o="urn:schemas-microsoft-com:office:office" xmlns:r="http://schemas.openxmlformats.org/officeDocument/2006/relationships" xmlns:m="http://schemas.openxmlformats.org/officeDocument/2006/math" xmlns:v="urn:schemas-microsoft-com:vml" xmlns:wp14="http://schemas.microsoft.com/office/word/2010/wordprocessingDrawing" xmlns:wp="http://schemas.openxmlformats.org/drawingml/2006/wordprocessingDrawing" xmlns:w10="urn:schemas-microsoft-com:office:word" xmlns:w="http://schemas.openxmlformats.org/wordprocessingml/2006/main" xmlns:w14="http://schemas.microsoft.com/office/word/2010/wordml" xmlns:w15="http://schemas.microsoft.com/office/word/2012/wordml" xmlns:w16cex="http://schemas.microsoft.com/office/word/2018/wordml/cex" xmlns:w16cid="http://schemas.microsoft.com/office/word/2016/wordml/cid" xmlns:w16="http://schemas.microsoft.com/office/word/2018/wordml" xmlns:w16sdtdh="http://schemas.microsoft.com/office/word/2020/wordml/sdtdatahash" xmlns:w16se="http://schemas.microsoft.com/office/word/2015/wordml/symex" xmlns:wpg="http://schemas.microsoft.com/office/word/2010/wordprocessingGroup" xmlns:wpi="http://schemas.microsoft.com/office/word/2010/wordprocessingInk" xmlns:wne="http://schemas.microsoft.com/office/word/2006/wordml" xmlns:wps="http://schemas.microsoft.com/office/word/2010/wordprocessingShape"/>
-</file>
-
 <file path=word/endnotes.xml><?xml version="1.0" encoding="utf-8"?>
 <w:endnotes xmlns:wpc="http://schemas.microsoft.com/office/word/2010/wordprocessingCanvas" xmlns:mc="http://schemas.openxmlformats.org/markup-compatibility/2006" xmlns:o="urn:schemas-microsoft-com:office:office" xmlns:r="http://schemas.openxmlformats.org/officeDocument/2006/relationships" xmlns:m="http://schemas.openxmlformats.org/officeDocument/2006/math" xmlns:v="urn:schemas-microsoft-com:vml" xmlns:wp14="http://schemas.microsoft.com/office/word/2010/wordprocessingDrawing" xmlns:wp="http://schemas.openxmlformats.org/drawingml/2006/wordprocessingDrawing" xmlns:w10="urn:schemas-microsoft-com:office:word" xmlns:w="http://schemas.openxmlformats.org/wordprocessingml/2006/main" xmlns:w14="http://schemas.microsoft.com/office/word/2010/wordml" xmlns:w15="http://schemas.microsoft.com/office/word/2012/wordml" xmlns:wpg="http://schemas.microsoft.com/office/word/2010/wordprocessingGroup" xmlns:wpi="http://schemas.microsoft.com/office/word/2010/wordprocessingInk" xmlns:wne="http://schemas.microsoft.com/office/word/2006/wordml" xmlns:wps="http://schemas.microsoft.com/office/word/2010/wordprocessingShape" mc:Ignorable="w14 w15 wp14">
   <w:endnote w:type="separator" w:id="-1">
@@ -10581,7 +11712,7 @@
 <w:numbering xmlns:wpc="http://schemas.microsoft.com/office/word/2010/wordprocessingCanvas" xmlns:mc="http://schemas.openxmlformats.org/markup-compatibility/2006" xmlns:o="urn:schemas-microsoft-com:office:office" xmlns:r="http://schemas.openxmlformats.org/officeDocument/2006/relationships" xmlns:m="http://schemas.openxmlformats.org/officeDocument/2006/math" xmlns:v="urn:schemas-microsoft-com:vml" xmlns:wp14="http://schemas.microsoft.com/office/word/2010/wordprocessingDrawing" xmlns:wp="http://schemas.openxmlformats.org/drawingml/2006/wordprocessingDrawing" xmlns:w10="urn:schemas-microsoft-com:office:word" xmlns:w="http://schemas.openxmlformats.org/wordprocessingml/2006/main" xmlns:w14="http://schemas.microsoft.com/office/word/2010/wordml" xmlns:w15="http://schemas.microsoft.com/office/word/2012/wordml" xmlns:wpg="http://schemas.microsoft.com/office/word/2010/wordprocessingGroup" xmlns:wpi="http://schemas.microsoft.com/office/word/2010/wordprocessingInk" xmlns:wne="http://schemas.microsoft.com/office/word/2006/wordml" xmlns:wps="http://schemas.microsoft.com/office/word/2010/wordprocessingShape" mc:Ignorable="w14 w15 wp14">
   <w:abstractNum w:abstractNumId="1" w15:restartNumberingAfterBreak="0">
     <w:multiLevelType w:val="hybridMultilevel"/>
-    <w:lvl w:ilvl="0" w15:tentative="1">
+    <w:lvl w:ilvl="0" w:tentative="1">
       <w:start w:val="1"/>
       <w:numFmt w:val="bullet"/>
       <w:lvlText w:val="●"/>
@@ -10590,7 +11721,7 @@
         <w:ind w:left="720" w:hanging="360"/>
       </w:pPr>
     </w:lvl>
-    <w:lvl w:ilvl="1" w15:tentative="1">
+    <w:lvl w:ilvl="1" w:tentative="1">
       <w:start w:val="1"/>
       <w:numFmt w:val="bullet"/>
       <w:lvlText w:val="○"/>
@@ -10599,7 +11730,7 @@
         <w:ind w:left="1440" w:hanging="360"/>
       </w:pPr>
     </w:lvl>
-    <w:lvl w:ilvl="2" w15:tentative="1">
+    <w:lvl w:ilvl="2" w:tentative="1">
       <w:start w:val="1"/>
       <w:numFmt w:val="bullet"/>
       <w:lvlText w:val="■"/>
@@ -10608,7 +11739,7 @@
         <w:ind w:left="2160" w:hanging="360"/>
       </w:pPr>
     </w:lvl>
-    <w:lvl w:ilvl="3" w15:tentative="1">
+    <w:lvl w:ilvl="3" w:tentative="1">
       <w:start w:val="1"/>
       <w:numFmt w:val="bullet"/>
       <w:lvlText w:val="●"/>
@@ -10617,7 +11748,7 @@
         <w:ind w:left="2880" w:hanging="360"/>
       </w:pPr>
     </w:lvl>
-    <w:lvl w:ilvl="4" w15:tentative="1">
+    <w:lvl w:ilvl="4" w:tentative="1">
       <w:start w:val="1"/>
       <w:numFmt w:val="bullet"/>
       <w:lvlText w:val="○"/>
@@ -10626,7 +11757,7 @@
         <w:ind w:left="3600" w:hanging="360"/>
       </w:pPr>
     </w:lvl>
-    <w:lvl w:ilvl="5" w15:tentative="1">
+    <w:lvl w:ilvl="5" w:tentative="1">
       <w:start w:val="1"/>
       <w:numFmt w:val="bullet"/>
       <w:lvlText w:val="■"/>
@@ -10635,7 +11766,7 @@
         <w:ind w:left="4320" w:hanging="360"/>
       </w:pPr>
     </w:lvl>
-    <w:lvl w:ilvl="6" w15:tentative="1">
+    <w:lvl w:ilvl="6" w:tentative="1">
       <w:start w:val="1"/>
       <w:numFmt w:val="bullet"/>
       <w:lvlText w:val="●"/>
@@ -10644,7 +11775,7 @@
         <w:ind w:left="5040" w:hanging="360"/>
       </w:pPr>
     </w:lvl>
-    <w:lvl w:ilvl="7" w15:tentative="1">
+    <w:lvl w:ilvl="7" w:tentative="1">
       <w:start w:val="1"/>
       <w:numFmt w:val="bullet"/>
       <w:lvlText w:val="●"/>
@@ -10653,7 +11784,7 @@
         <w:ind w:left="5760" w:hanging="360"/>
       </w:pPr>
     </w:lvl>
-    <w:lvl w:ilvl="8" w15:tentative="1">
+    <w:lvl w:ilvl="8" w:tentative="1">
       <w:start w:val="1"/>
       <w:numFmt w:val="bullet"/>
       <w:lvlText w:val="●"/>
@@ -10665,7 +11796,7 @@
   </w:abstractNum>
   <w:abstractNum w:abstractNumId="2" w15:restartNumberingAfterBreak="0">
     <w:multiLevelType w:val="hybridMultilevel"/>
-    <w:lvl w:ilvl="0" w15:tentative="1">
+    <w:lvl w:ilvl="0" w:tentative="1">
       <w:start w:val="1"/>
       <w:numFmt w:val="bullet"/>
       <w:lvlText w:val="•"/>
@@ -10674,7 +11805,7 @@
         <w:ind w:left="460" w:hanging="260"/>
       </w:pPr>
     </w:lvl>
-    <w:lvl w:ilvl="1" w15:tentative="1">
+    <w:lvl w:ilvl="1" w:tentative="1">
       <w:start w:val="1"/>
       <w:numFmt w:val="bullet"/>
       <w:lvlText w:val="–"/>
@@ -10686,7 +11817,7 @@
   </w:abstractNum>
   <w:abstractNum w:abstractNumId="3" w15:restartNumberingAfterBreak="0">
     <w:multiLevelType w:val="hybridMultilevel"/>
-    <w:lvl w:ilvl="0" w15:tentative="1">
+    <w:lvl w:ilvl="0" w:tentative="1">
       <w:start w:val="1"/>
       <w:numFmt w:val="decimal"/>
       <w:lvlText w:val="%1."/>
@@ -10729,6 +11860,25 @@
     </w:rPrDefault>
     <w:pPrDefault/>
   </w:docDefaults>
+  <w:style w:type="paragraph" w:styleId="Normal" w:default="1">
+    <w:name w:val="Normal"/>
+    <w:qFormat/>
+  </w:style>
+  <w:style w:type="table" w:styleId="TableNormal" w:default="true">
+    <w:name w:val="Normal Table"/>
+    <w:uiPriority w:val="99"/>
+    <w:semiHidden/>
+    <w:unhideWhenUsed/>
+    <w:tblPr>
+      <w:tblInd w:type="dxa" w:w="0"/>
+      <w:tblCellMar>
+        <w:top w:type="dxa" w:w="0"/>
+        <w:left w:type="dxa" w:w="108"/>
+        <w:bottom w:type="dxa" w:w="0"/>
+        <w:right w:type="dxa" w:w="108"/>
+      </w:tblCellMar>
+    </w:tblPr>
+  </w:style>
   <w:style w:type="paragraph" w:styleId="Title">
     <w:name w:val="Title"/>
     <w:basedOn w:val="Normal"/>
@@ -10737,39 +11887,6 @@
     <w:rPr>
       <w:sz w:val="56"/>
       <w:szCs w:val="56"/>
-    </w:rPr>
-  </w:style>
-  <w:style w:type="paragraph" w:styleId="Heading1">
-    <w:name w:val="Heading 1"/>
-    <w:basedOn w:val="Normal"/>
-    <w:next w:val="Normal"/>
-    <w:qFormat/>
-    <w:rPr>
-      <w:color w:val="2E74B5"/>
-      <w:sz w:val="32"/>
-      <w:szCs w:val="32"/>
-    </w:rPr>
-  </w:style>
-  <w:style w:type="paragraph" w:styleId="Heading2">
-    <w:name w:val="Heading 2"/>
-    <w:basedOn w:val="Normal"/>
-    <w:next w:val="Normal"/>
-    <w:qFormat/>
-    <w:rPr>
-      <w:color w:val="2E74B5"/>
-      <w:sz w:val="26"/>
-      <w:szCs w:val="26"/>
-    </w:rPr>
-  </w:style>
-  <w:style w:type="paragraph" w:styleId="Heading3">
-    <w:name w:val="Heading 3"/>
-    <w:basedOn w:val="Normal"/>
-    <w:next w:val="Normal"/>
-    <w:qFormat/>
-    <w:rPr>
-      <w:color w:val="1F4D78"/>
-      <w:sz w:val="24"/>
-      <w:szCs w:val="24"/>
     </w:rPr>
   </w:style>
   <w:style w:type="paragraph" w:styleId="Heading4">
@@ -10955,4 +12072,294 @@
     </w:rPr>
   </w:style>
 </w:styles>
+</file>
+
+<file path=word/theme/theme1.xml><?xml version="1.0" encoding="utf-8"?>
+<a:theme xmlns:a="http://schemas.openxmlformats.org/drawingml/2006/main" name="Office Theme">
+  <a:themeElements>
+    <a:clrScheme name="Office">
+      <a:dk1>
+        <a:sysClr val="windowText" lastClr="000000"/>
+      </a:dk1>
+      <a:lt1>
+        <a:sysClr val="window" lastClr="FFFFFF"/>
+      </a:lt1>
+      <a:dk2>
+        <a:srgbClr val="44546A"/>
+      </a:dk2>
+      <a:lt2>
+        <a:srgbClr val="E7E6E6"/>
+      </a:lt2>
+      <a:accent1>
+        <a:srgbClr val="4472C4"/>
+      </a:accent1>
+      <a:accent2>
+        <a:srgbClr val="ED7D31"/>
+      </a:accent2>
+      <a:accent3>
+        <a:srgbClr val="A5A5A5"/>
+      </a:accent3>
+      <a:accent4>
+        <a:srgbClr val="FFC000"/>
+      </a:accent4>
+      <a:accent5>
+        <a:srgbClr val="5B9BD5"/>
+      </a:accent5>
+      <a:accent6>
+        <a:srgbClr val="70AD47"/>
+      </a:accent6>
+      <a:hlink>
+        <a:srgbClr val="0563C1"/>
+      </a:hlink>
+      <a:folHlink>
+        <a:srgbClr val="954F72"/>
+      </a:folHlink>
+    </a:clrScheme>
+    <a:fontScheme name="Office">
+      <a:majorFont>
+        <a:latin typeface="Calibri Light" panose="020F0302020204030204"/>
+        <a:ea typeface=""/>
+        <a:cs typeface=""/>
+        <a:font script="Jpan" typeface="游ゴシック Light"/>
+        <a:font script="Hang" typeface="맑은 고딕"/>
+        <a:font script="Hans" typeface="等线 Light"/>
+        <a:font script="Hant" typeface="新細明體"/>
+        <a:font script="Arab" typeface="Times New Roman"/>
+        <a:font script="Hebr" typeface="Times New Roman"/>
+        <a:font script="Thai" typeface="Angsana New"/>
+        <a:font script="Ethi" typeface="Nyala"/>
+        <a:font script="Beng" typeface="Vrinda"/>
+        <a:font script="Gujr" typeface="Shruti"/>
+        <a:font script="Khmr" typeface="MoolBoran"/>
+        <a:font script="Knda" typeface="Tunga"/>
+        <a:font script="Guru" typeface="Raavi"/>
+        <a:font script="Cans" typeface="Euphemia"/>
+        <a:font script="Cher" typeface="Plantagenet Cherokee"/>
+        <a:font script="Yiii" typeface="Microsoft Yi Baiti"/>
+        <a:font script="Tibt" typeface="Microsoft Himalaya"/>
+        <a:font script="Thaa" typeface="MV Boli"/>
+        <a:font script="Deva" typeface="Mangal"/>
+        <a:font script="Telu" typeface="Gautami"/>
+        <a:font script="Taml" typeface="Latha"/>
+        <a:font script="Syrc" typeface="Estrangelo Edessa"/>
+        <a:font script="Orya" typeface="Kalinga"/>
+        <a:font script="Mlym" typeface="Kartika"/>
+        <a:font script="Laoo" typeface="DokChampa"/>
+        <a:font script="Sinh" typeface="Iskoola Pota"/>
+        <a:font script="Mong" typeface="Mongolian Baiti"/>
+        <a:font script="Viet" typeface="Times New Roman"/>
+        <a:font script="Uigh" typeface="Microsoft Uighur"/>
+        <a:font script="Geor" typeface="Sylfaen"/>
+        <a:font script="Armn" typeface="Arial"/>
+        <a:font script="Bugi" typeface="Leelawadee UI"/>
+        <a:font script="Bopo" typeface="Microsoft JhengHei"/>
+        <a:font script="Java" typeface="Javanese Text"/>
+        <a:font script="Lisu" typeface="Segoe UI"/>
+        <a:font script="Mymr" typeface="Myanmar Text"/>
+        <a:font script="Nkoo" typeface="Ebrima"/>
+        <a:font script="Olck" typeface="Nirmala UI"/>
+        <a:font script="Osma" typeface="Ebrima"/>
+        <a:font script="Phag" typeface="Phagspa"/>
+        <a:font script="Syrn" typeface="Estrangelo Edessa"/>
+        <a:font script="Syrj" typeface="Estrangelo Edessa"/>
+        <a:font script="Syre" typeface="Estrangelo Edessa"/>
+        <a:font script="Sora" typeface="Nirmala UI"/>
+        <a:font script="Tale" typeface="Microsoft Tai Le"/>
+        <a:font script="Talu" typeface="Microsoft New Tai Lue"/>
+        <a:font script="Tfng" typeface="Ebrima"/>
+      </a:majorFont>
+      <a:minorFont>
+        <a:latin typeface="Calibri" panose="020F0502020204030204"/>
+        <a:ea typeface=""/>
+        <a:cs typeface=""/>
+        <a:font script="Jpan" typeface="游明朝"/>
+        <a:font script="Hang" typeface="맑은 고딕"/>
+        <a:font script="Hans" typeface="等线"/>
+        <a:font script="Hant" typeface="新細明體"/>
+        <a:font script="Arab" typeface="Arial"/>
+        <a:font script="Hebr" typeface="Arial"/>
+        <a:font script="Thai" typeface="Cordia New"/>
+        <a:font script="Ethi" typeface="Nyala"/>
+        <a:font script="Beng" typeface="Vrinda"/>
+        <a:font script="Gujr" typeface="Shruti"/>
+        <a:font script="Khmr" typeface="DaunPenh"/>
+        <a:font script="Knda" typeface="Tunga"/>
+        <a:font script="Guru" typeface="Raavi"/>
+        <a:font script="Cans" typeface="Euphemia"/>
+        <a:font script="Cher" typeface="Plantagenet Cherokee"/>
+        <a:font script="Yiii" typeface="Microsoft Yi Baiti"/>
+        <a:font script="Tibt" typeface="Microsoft Himalaya"/>
+        <a:font script="Thaa" typeface="MV Boli"/>
+        <a:font script="Deva" typeface="Mangal"/>
+        <a:font script="Telu" typeface="Gautami"/>
+        <a:font script="Taml" typeface="Latha"/>
+        <a:font script="Syrc" typeface="Estrangelo Edessa"/>
+        <a:font script="Orya" typeface="Kalinga"/>
+        <a:font script="Mlym" typeface="Kartika"/>
+        <a:font script="Laoo" typeface="DokChampa"/>
+        <a:font script="Sinh" typeface="Iskoola Pota"/>
+        <a:font script="Mong" typeface="Mongolian Baiti"/>
+        <a:font script="Viet" typeface="Arial"/>
+        <a:font script="Uigh" typeface="Microsoft Uighur"/>
+        <a:font script="Geor" typeface="Sylfaen"/>
+        <a:font script="Armn" typeface="Arial"/>
+        <a:font script="Bugi" typeface="Leelawadee UI"/>
+        <a:font script="Bopo" typeface="Microsoft JhengHei"/>
+        <a:font script="Java" typeface="Javanese Text"/>
+        <a:font script="Lisu" typeface="Segoe UI"/>
+        <a:font script="Mymr" typeface="Myanmar Text"/>
+        <a:font script="Nkoo" typeface="Ebrima"/>
+        <a:font script="Olck" typeface="Nirmala UI"/>
+        <a:font script="Osma" typeface="Ebrima"/>
+        <a:font script="Phag" typeface="Phagspa"/>
+        <a:font script="Syrn" typeface="Estrangelo Edessa"/>
+        <a:font script="Syrj" typeface="Estrangelo Edessa"/>
+        <a:font script="Syre" typeface="Estrangelo Edessa"/>
+        <a:font script="Sora" typeface="Nirmala UI"/>
+        <a:font script="Tale" typeface="Microsoft Tai Le"/>
+        <a:font script="Talu" typeface="Microsoft New Tai Lue"/>
+        <a:font script="Tfng" typeface="Ebrima"/>
+      </a:minorFont>
+    </a:fontScheme>
+    <a:fmtScheme name="Office">
+      <a:fillStyleLst>
+        <a:solidFill>
+          <a:schemeClr val="phClr"/>
+        </a:solidFill>
+        <a:gradFill rotWithShape="true">
+          <a:gsLst>
+            <a:gs pos="0">
+              <a:schemeClr val="phClr">
+                <a:lumMod val="110000"/>
+                <a:satMod val="105000"/>
+                <a:tint val="67000"/>
+              </a:schemeClr>
+            </a:gs>
+            <a:gs pos="50000">
+              <a:schemeClr val="phClr">
+                <a:lumMod val="105000"/>
+                <a:satMod val="103000"/>
+                <a:tint val="73000"/>
+              </a:schemeClr>
+            </a:gs>
+            <a:gs pos="100000">
+              <a:schemeClr val="phClr">
+                <a:lumMod val="105000"/>
+                <a:satMod val="109000"/>
+                <a:tint val="81000"/>
+              </a:schemeClr>
+            </a:gs>
+          </a:gsLst>
+          <a:lin ang="5400000" scaled="false"/>
+        </a:gradFill>
+        <a:gradFill rotWithShape="true">
+          <a:gsLst>
+            <a:gs pos="0">
+              <a:schemeClr val="phClr">
+                <a:satMod val="103000"/>
+                <a:lumMod val="102000"/>
+                <a:tint val="94000"/>
+              </a:schemeClr>
+            </a:gs>
+            <a:gs pos="50000">
+              <a:schemeClr val="phClr">
+                <a:satMod val="110000"/>
+                <a:lumMod val="100000"/>
+                <a:shade val="100000"/>
+              </a:schemeClr>
+            </a:gs>
+            <a:gs pos="100000">
+              <a:schemeClr val="phClr">
+                <a:lumMod val="99000"/>
+                <a:satMod val="120000"/>
+                <a:shade val="78000"/>
+              </a:schemeClr>
+            </a:gs>
+          </a:gsLst>
+          <a:lin ang="5400000" scaled="false"/>
+        </a:gradFill>
+      </a:fillStyleLst>
+      <a:lnStyleLst>
+        <a:ln w="6350" cap="flat" cmpd="sng" algn="ctr">
+          <a:solidFill>
+            <a:schemeClr val="phClr"/>
+          </a:solidFill>
+          <a:prstDash val="solid"/>
+          <a:miter lim="800000"/>
+        </a:ln>
+        <a:ln w="12700" cap="flat" cmpd="sng" algn="ctr">
+          <a:solidFill>
+            <a:schemeClr val="phClr"/>
+          </a:solidFill>
+          <a:prstDash val="solid"/>
+          <a:miter lim="800000"/>
+        </a:ln>
+        <a:ln w="19050" cap="flat" cmpd="sng" algn="ctr">
+          <a:solidFill>
+            <a:schemeClr val="phClr"/>
+          </a:solidFill>
+          <a:prstDash val="solid"/>
+          <a:miter lim="800000"/>
+        </a:ln>
+      </a:lnStyleLst>
+      <a:effectStyleLst>
+        <a:effectStyle>
+          <a:effectLst/>
+        </a:effectStyle>
+        <a:effectStyle>
+          <a:effectLst/>
+        </a:effectStyle>
+        <a:effectStyle>
+          <a:effectLst>
+            <a:outerShdw blurRad="57150" dist="19050" dir="5400000" algn="ctr" rotWithShape="false">
+              <a:srgbClr val="000000">
+                <a:alpha val="63000"/>
+              </a:srgbClr>
+            </a:outerShdw>
+          </a:effectLst>
+        </a:effectStyle>
+      </a:effectStyleLst>
+      <a:bgFillStyleLst>
+        <a:solidFill>
+          <a:schemeClr val="phClr"/>
+        </a:solidFill>
+        <a:solidFill>
+          <a:schemeClr val="phClr">
+            <a:tint val="95000"/>
+            <a:satMod val="170000"/>
+          </a:schemeClr>
+        </a:solidFill>
+        <a:gradFill rotWithShape="true">
+          <a:gsLst>
+            <a:gs pos="0">
+              <a:schemeClr val="phClr">
+                <a:tint val="93000"/>
+                <a:satMod val="150000"/>
+                <a:shade val="98000"/>
+                <a:lumMod val="102000"/>
+              </a:schemeClr>
+            </a:gs>
+            <a:gs pos="50000">
+              <a:schemeClr val="phClr">
+                <a:tint val="98000"/>
+                <a:satMod val="130000"/>
+                <a:shade val="90000"/>
+                <a:lumMod val="103000"/>
+              </a:schemeClr>
+            </a:gs>
+            <a:gs pos="100000">
+              <a:schemeClr val="phClr">
+                <a:shade val="63000"/>
+                <a:satMod val="120000"/>
+              </a:schemeClr>
+            </a:gs>
+          </a:gsLst>
+          <a:lin ang="5400000" scaled="false"/>
+        </a:gradFill>
+      </a:bgFillStyleLst>
+    </a:fmtScheme>
+  </a:themeElements>
+  <a:objectDefaults/>
+  <a:extraClrSchemeLst/>
+</a:theme>
 </file>
</xml_diff>

<commit_message>
docs: Aktionen auf das Video - Band (FA-20) anzuschliessen, kurze Unterbrechung als neue Anforderung (AD v1.7 4.5 / TK v3.22 9.7.7); Nachzuege #425/#426
</commit_message>
<xml_diff>
--- a/docs/Anforderungsdokument_Digital-Signage-Tool.docx
+++ b/docs/Anforderungsdokument_Digital-Signage-Tool.docx
@@ -3082,7 +3082,25 @@
                 <w:sz w:val="20"/>
                 <w:szCs w:val="20"/>
               </w:rPr>
-              <w:t xml:space="preserve"> im Band rotieren. Die sequenzielle Werbepause (FA-04) bleibt zusätzlich möglich. Details: 4.5. | Muss</w:t>
+              <w:t xml:space="preserve"> im Band rotieren. Eine Aktion kann das laufende Video auch </w:t>
+            </w:r>
+            <w:r>
+              <w:rPr>
+                <w:rFonts w:ascii="Arial" w:cs="Arial" w:eastAsia="Arial" w:hAnsi="Arial"/>
+                <w:b/>
+                <w:bCs/>
+                <w:sz w:val="20"/>
+                <w:szCs w:val="20"/>
+              </w:rPr>
+              <w:t xml:space="preserve">kurz unterbrechen</w:t>
+            </w:r>
+            <w:r>
+              <w:rPr>
+                <w:rFonts w:ascii="Arial" w:cs="Arial" w:eastAsia="Arial" w:hAnsi="Arial"/>
+                <w:sz w:val="20"/>
+                <w:szCs w:val="20"/>
+              </w:rPr>
+              <w:t xml:space="preserve"> (Video pausiert, Aktion, Video läuft weiter). Die sequenzielle Werbepause (FA-04) bleibt zusätzlich möglich. Details: 4.5. | Muss</w:t>
             </w:r>
           </w:p>
         </w:tc>
@@ -7034,6 +7052,417 @@
           <w:szCs w:val="20"/>
         </w:rPr>
         <w:t xml:space="preserve"> (Logo, Titel, Preis/CTA); eine längere Beschreibung ist dort nicht vorgesehen. Höhere Bänder sind über eigene Vorlagen möglich — sie verkleinern beim Split-Screen entsprechend das Video.</w:t>
+      </w:r>
+    </w:p>
+    <w:p>
+      <w:pPr>
+        <w:spacing w:after="120"/>
+      </w:pPr>
+      <w:r>
+        <w:rPr>
+          <w:rFonts w:ascii="Arial" w:cs="Arial" w:eastAsia="Arial" w:hAnsi="Arial"/>
+          <w:b/>
+          <w:bCs/>
+          <w:sz w:val="20"/>
+          <w:szCs w:val="20"/>
+        </w:rPr>
+        <w:t xml:space="preserve">Eine Aktion auf das Video legen (User-Entscheidung 15.10.2026).</w:t>
+      </w:r>
+      <w:r>
+        <w:rPr>
+          <w:rFonts w:ascii="Arial" w:cs="Arial" w:eastAsia="Arial" w:hAnsi="Arial"/>
+          <w:sz w:val="20"/>
+          <w:szCs w:val="20"/>
+        </w:rPr>
+        <w:t xml:space="preserve"> In der Zusammenstellung zieht man</w:t>
+      </w:r>
+    </w:p>
+    <w:p>
+      <w:pPr>
+        <w:spacing w:after="120"/>
+      </w:pPr>
+      <w:r>
+        <w:rPr>
+          <w:rFonts w:ascii="Arial" w:cs="Arial" w:eastAsia="Arial" w:hAnsi="Arial"/>
+          <w:sz w:val="20"/>
+          <w:szCs w:val="20"/>
+        </w:rPr>
+        <w:t xml:space="preserve">eine Aktion </w:t>
+      </w:r>
+      <w:r>
+        <w:rPr>
+          <w:rFonts w:ascii="Arial" w:cs="Arial" w:eastAsia="Arial" w:hAnsi="Arial"/>
+          <w:b/>
+          <w:bCs/>
+          <w:sz w:val="20"/>
+          <w:szCs w:val="20"/>
+        </w:rPr>
+        <w:t xml:space="preserve">auf das Video</w:t>
+      </w:r>
+      <w:r>
+        <w:rPr>
+          <w:rFonts w:ascii="Arial" w:cs="Arial" w:eastAsia="Arial" w:hAnsi="Arial"/>
+          <w:sz w:val="20"/>
+          <w:szCs w:val="20"/>
+        </w:rPr>
+        <w:t xml:space="preserve"> – sie wird dann </w:t>
+      </w:r>
+      <w:r>
+        <w:rPr>
+          <w:rFonts w:ascii="Arial" w:cs="Arial" w:eastAsia="Arial" w:hAnsi="Arial"/>
+          <w:b/>
+          <w:bCs/>
+          <w:sz w:val="20"/>
+          <w:szCs w:val="20"/>
+        </w:rPr>
+        <w:t xml:space="preserve">während</w:t>
+      </w:r>
+      <w:r>
+        <w:rPr>
+          <w:rFonts w:ascii="Arial" w:cs="Arial" w:eastAsia="Arial" w:hAnsi="Arial"/>
+          <w:sz w:val="20"/>
+          <w:szCs w:val="20"/>
+        </w:rPr>
+        <w:t xml:space="preserve"> des Videos gezeigt, nicht davor oder danach.</w:t>
+      </w:r>
+    </w:p>
+    <w:p>
+      <w:pPr>
+        <w:spacing w:after="120"/>
+      </w:pPr>
+      <w:r>
+        <w:rPr>
+          <w:rFonts w:ascii="Arial" w:cs="Arial" w:eastAsia="Arial" w:hAnsi="Arial"/>
+          <w:sz w:val="20"/>
+          <w:szCs w:val="20"/>
+        </w:rPr>
+        <w:t xml:space="preserve">Zwei Wirkungen sind möglich:</w:t>
+      </w:r>
+    </w:p>
+    <w:p>
+      <w:pPr>
+        <w:pStyle w:val="ListParagraph"/>
+        <w:numPr>
+          <w:ilvl w:val="0"/>
+          <w:numId w:val="2"/>
+        </w:numPr>
+      </w:pPr>
+      <w:r>
+        <w:rPr>
+          <w:rFonts w:ascii="Arial" w:cs="Arial" w:eastAsia="Arial" w:hAnsi="Arial"/>
+          <w:b/>
+          <w:bCs/>
+          <w:sz w:val="20"/>
+          <w:szCs w:val="20"/>
+        </w:rPr>
+        <w:t xml:space="preserve">Band (parallel, FA-20):</w:t>
+      </w:r>
+      <w:r>
+        <w:rPr>
+          <w:rFonts w:ascii="Arial" w:cs="Arial" w:eastAsia="Arial" w:hAnsi="Arial"/>
+          <w:sz w:val="20"/>
+          <w:szCs w:val="20"/>
+        </w:rPr>
+        <w:t xml:space="preserve"> Die Aktion erscheint im Werbeband (Split-Screen oder Einblendung); das</w:t>
+      </w:r>
+    </w:p>
+    <w:p>
+      <w:pPr>
+        <w:spacing w:after="120"/>
+      </w:pPr>
+      <w:r>
+        <w:rPr>
+          <w:rFonts w:ascii="Arial" w:cs="Arial" w:eastAsia="Arial" w:hAnsi="Arial"/>
+          <w:sz w:val="20"/>
+          <w:szCs w:val="20"/>
+        </w:rPr>
+        <w:t xml:space="preserve">Video läuft </w:t>
+      </w:r>
+      <w:r>
+        <w:rPr>
+          <w:rFonts w:ascii="Arial" w:cs="Arial" w:eastAsia="Arial" w:hAnsi="Arial"/>
+          <w:b/>
+          <w:bCs/>
+          <w:sz w:val="20"/>
+          <w:szCs w:val="20"/>
+        </w:rPr>
+        <w:t xml:space="preserve">weiter</w:t>
+      </w:r>
+      <w:r>
+        <w:rPr>
+          <w:rFonts w:ascii="Arial" w:cs="Arial" w:eastAsia="Arial" w:hAnsi="Arial"/>
+          <w:sz w:val="20"/>
+          <w:szCs w:val="20"/>
+        </w:rPr>
+        <w:t xml:space="preserve">. Mehrere Aktionen können im Band </w:t>
+      </w:r>
+      <w:r>
+        <w:rPr>
+          <w:rFonts w:ascii="Arial" w:cs="Arial" w:eastAsia="Arial" w:hAnsi="Arial"/>
+          <w:b/>
+          <w:bCs/>
+          <w:sz w:val="20"/>
+          <w:szCs w:val="20"/>
+        </w:rPr>
+        <w:t xml:space="preserve">rotieren</w:t>
+      </w:r>
+      <w:r>
+        <w:rPr>
+          <w:rFonts w:ascii="Arial" w:cs="Arial" w:eastAsia="Arial" w:hAnsi="Arial"/>
+          <w:sz w:val="20"/>
+          <w:szCs w:val="20"/>
+        </w:rPr>
+        <w:t xml:space="preserve">.</w:t>
+      </w:r>
+    </w:p>
+    <w:p>
+      <w:pPr>
+        <w:pStyle w:val="ListParagraph"/>
+        <w:numPr>
+          <w:ilvl w:val="0"/>
+          <w:numId w:val="2"/>
+        </w:numPr>
+      </w:pPr>
+      <w:r>
+        <w:rPr>
+          <w:rFonts w:ascii="Arial" w:cs="Arial" w:eastAsia="Arial" w:hAnsi="Arial"/>
+          <w:b/>
+          <w:bCs/>
+          <w:sz w:val="20"/>
+          <w:szCs w:val="20"/>
+        </w:rPr>
+        <w:t xml:space="preserve">Kurze Unterbrechung (neu):</w:t>
+      </w:r>
+      <w:r>
+        <w:rPr>
+          <w:rFonts w:ascii="Arial" w:cs="Arial" w:eastAsia="Arial" w:hAnsi="Arial"/>
+          <w:sz w:val="20"/>
+          <w:szCs w:val="20"/>
+        </w:rPr>
+        <w:t xml:space="preserve"> Die Aktion </w:t>
+      </w:r>
+      <w:r>
+        <w:rPr>
+          <w:rFonts w:ascii="Arial" w:cs="Arial" w:eastAsia="Arial" w:hAnsi="Arial"/>
+          <w:b/>
+          <w:bCs/>
+          <w:sz w:val="20"/>
+          <w:szCs w:val="20"/>
+        </w:rPr>
+        <w:t xml:space="preserve">unterbricht</w:t>
+      </w:r>
+      <w:r>
+        <w:rPr>
+          <w:rFonts w:ascii="Arial" w:cs="Arial" w:eastAsia="Arial" w:hAnsi="Arial"/>
+          <w:sz w:val="20"/>
+          <w:szCs w:val="20"/>
+        </w:rPr>
+        <w:t xml:space="preserve"> das Video – das Video </w:t>
+      </w:r>
+      <w:r>
+        <w:rPr>
+          <w:rFonts w:ascii="Arial" w:cs="Arial" w:eastAsia="Arial" w:hAnsi="Arial"/>
+          <w:b/>
+          <w:bCs/>
+          <w:sz w:val="20"/>
+          <w:szCs w:val="20"/>
+        </w:rPr>
+        <w:t xml:space="preserve">pausiert</w:t>
+      </w:r>
+      <w:r>
+        <w:rPr>
+          <w:rFonts w:ascii="Arial" w:cs="Arial" w:eastAsia="Arial" w:hAnsi="Arial"/>
+          <w:sz w:val="20"/>
+          <w:szCs w:val="20"/>
+        </w:rPr>
+        <w:t xml:space="preserve">, die</w:t>
+      </w:r>
+    </w:p>
+    <w:p>
+      <w:pPr>
+        <w:spacing w:after="120"/>
+      </w:pPr>
+      <w:r>
+        <w:rPr>
+          <w:rFonts w:ascii="Arial" w:cs="Arial" w:eastAsia="Arial" w:hAnsi="Arial"/>
+          <w:sz w:val="20"/>
+          <w:szCs w:val="20"/>
+        </w:rPr>
+        <w:t xml:space="preserve">Aktion läuft, danach läuft das Video </w:t>
+      </w:r>
+      <w:r>
+        <w:rPr>
+          <w:rFonts w:ascii="Arial" w:cs="Arial" w:eastAsia="Arial" w:hAnsi="Arial"/>
+          <w:b/>
+          <w:bCs/>
+          <w:sz w:val="20"/>
+          <w:szCs w:val="20"/>
+        </w:rPr>
+        <w:t xml:space="preserve">an derselben Stelle weiter</w:t>
+      </w:r>
+      <w:r>
+        <w:rPr>
+          <w:rFonts w:ascii="Arial" w:cs="Arial" w:eastAsia="Arial" w:hAnsi="Arial"/>
+          <w:sz w:val="20"/>
+          <w:szCs w:val="20"/>
+        </w:rPr>
+        <w:t xml:space="preserve">. Modell und Render hierfür sind</w:t>
+      </w:r>
+    </w:p>
+    <w:p>
+      <w:pPr>
+        <w:spacing w:after="120"/>
+      </w:pPr>
+      <w:r>
+        <w:rPr>
+          <w:rFonts w:ascii="Arial" w:cs="Arial" w:eastAsia="Arial" w:hAnsi="Arial"/>
+          <w:sz w:val="20"/>
+          <w:szCs w:val="20"/>
+        </w:rPr>
+        <w:t xml:space="preserve">noch zu entwerfen (s. Technisches Konzept 9.7.7).</w:t>
+      </w:r>
+    </w:p>
+    <w:p>
+      <w:pPr>
+        <w:spacing w:after="120"/>
+      </w:pPr>
+      <w:r>
+        <w:rPr>
+          <w:rFonts w:ascii="Arial" w:cs="Arial" w:eastAsia="Arial" w:hAnsi="Arial"/>
+          <w:sz w:val="20"/>
+          <w:szCs w:val="20"/>
+        </w:rPr>
+        <w:t xml:space="preserve">Bisher war nur das </w:t>
+      </w:r>
+      <w:r>
+        <w:rPr>
+          <w:rFonts w:ascii="Arial" w:cs="Arial" w:eastAsia="Arial" w:hAnsi="Arial"/>
+          <w:b/>
+          <w:bCs/>
+          <w:sz w:val="20"/>
+          <w:szCs w:val="20"/>
+        </w:rPr>
+        <w:t xml:space="preserve">sequenzielle</w:t>
+      </w:r>
+      <w:r>
+        <w:rPr>
+          <w:rFonts w:ascii="Arial" w:cs="Arial" w:eastAsia="Arial" w:hAnsi="Arial"/>
+          <w:sz w:val="20"/>
+          <w:szCs w:val="20"/>
+        </w:rPr>
+        <w:t xml:space="preserve"> Einordnen </w:t>
+      </w:r>
+      <w:r>
+        <w:rPr>
+          <w:rFonts w:ascii="Arial" w:cs="Arial" w:eastAsia="Arial" w:hAnsi="Arial"/>
+          <w:i/>
+          <w:iCs/>
+          <w:sz w:val="20"/>
+          <w:szCs w:val="20"/>
+        </w:rPr>
+        <w:t xml:space="preserve">zwischen</w:t>
+      </w:r>
+      <w:r>
+        <w:rPr>
+          <w:rFonts w:ascii="Arial" w:cs="Arial" w:eastAsia="Arial" w:hAnsi="Arial"/>
+          <w:sz w:val="20"/>
+          <w:szCs w:val="20"/>
+        </w:rPr>
+        <w:t xml:space="preserve"> den Elementen möglich (vor/nach dem Video,</w:t>
+      </w:r>
+    </w:p>
+    <w:p>
+      <w:pPr>
+        <w:spacing w:after="120"/>
+      </w:pPr>
+      <w:r>
+        <w:rPr>
+          <w:rFonts w:ascii="Arial" w:cs="Arial" w:eastAsia="Arial" w:hAnsi="Arial"/>
+          <w:sz w:val="20"/>
+          <w:szCs w:val="20"/>
+        </w:rPr>
+        <w:t xml:space="preserve">FA-04/FA-05). Das Drag-and-drop </w:t>
+      </w:r>
+      <w:r>
+        <w:rPr>
+          <w:rFonts w:ascii="Arial" w:cs="Arial" w:eastAsia="Arial" w:hAnsi="Arial"/>
+          <w:b/>
+          <w:bCs/>
+          <w:sz w:val="20"/>
+          <w:szCs w:val="20"/>
+        </w:rPr>
+        <w:t xml:space="preserve">zwischen Zeitleisten-Blöcken</w:t>
+      </w:r>
+      <w:r>
+        <w:rPr>
+          <w:rFonts w:ascii="Arial" w:cs="Arial" w:eastAsia="Arial" w:hAnsi="Arial"/>
+          <w:sz w:val="20"/>
+          <w:szCs w:val="20"/>
+        </w:rPr>
+        <w:t xml:space="preserve"> bleibt erhalten; das Ablegen </w:t>
+      </w:r>
+      <w:r>
+        <w:rPr>
+          <w:rFonts w:ascii="Arial" w:cs="Arial" w:eastAsia="Arial" w:hAnsi="Arial"/>
+          <w:sz w:val="20"/>
+          <w:szCs w:val="20"/>
+        </w:rPr>
+        <w:t xml:space="preserve"/>
+      </w:r>
+      <w:r>
+        <w:rPr>
+          <w:rFonts w:ascii="Arial" w:cs="Arial" w:eastAsia="Arial" w:hAnsi="Arial"/>
+          <w:sz w:val="20"/>
+          <w:szCs w:val="20"/>
+        </w:rPr>
+        <w:t xml:space="preserve">auf dem</w:t>
+      </w:r>
+    </w:p>
+    <w:p>
+      <w:pPr>
+        <w:spacing w:after="120"/>
+      </w:pPr>
+      <w:r>
+        <w:rPr>
+          <w:rFonts w:ascii="Arial" w:cs="Arial" w:eastAsia="Arial" w:hAnsi="Arial"/>
+          <w:sz w:val="20"/>
+          <w:szCs w:val="20"/>
+        </w:rPr>
+        <w:t xml:space="preserve">Video</w:t>
+      </w:r>
+      <w:r>
+        <w:rPr>
+          <w:rFonts w:ascii="Arial" w:cs="Arial" w:eastAsia="Arial" w:hAnsi="Arial"/>
+          <w:sz w:val="20"/>
+          <w:szCs w:val="20"/>
+        </w:rPr>
+        <w:t xml:space="preserve"/>
+      </w:r>
+      <w:r>
+        <w:rPr>
+          <w:rFonts w:ascii="Arial" w:cs="Arial" w:eastAsia="Arial" w:hAnsi="Arial"/>
+          <w:sz w:val="20"/>
+          <w:szCs w:val="20"/>
+        </w:rPr>
+        <w:t xml:space="preserve"> ist der neue Weg </w:t>
+      </w:r>
+      <w:r>
+        <w:rPr>
+          <w:rFonts w:ascii="Arial" w:cs="Arial" w:eastAsia="Arial" w:hAnsi="Arial"/>
+          <w:i/>
+          <w:iCs/>
+          <w:sz w:val="20"/>
+          <w:szCs w:val="20"/>
+        </w:rPr>
+        <w:t xml:space="preserve">während</w:t>
+      </w:r>
+      <w:r>
+        <w:rPr>
+          <w:rFonts w:ascii="Arial" w:cs="Arial" w:eastAsia="Arial" w:hAnsi="Arial"/>
+          <w:sz w:val="20"/>
+          <w:szCs w:val="20"/>
+        </w:rPr>
+        <w:t xml:space="preserve"> des Videos.</w:t>
       </w:r>
     </w:p>
     <w:p>

</xml_diff>

<commit_message>
426: AD v1.8 / TK v3.26 - Modell Unterbrechungen (Einschub am Video) + Plan
</commit_message>
<xml_diff>
--- a/docs/Anforderungsdokument_Digital-Signage-Tool.docx
+++ b/docs/Anforderungsdokument_Digital-Signage-Tool.docx
@@ -162,7 +162,7 @@
           <w:sz w:val="20"/>
           <w:szCs w:val="20"/>
         </w:rPr>
-        <w:t xml:space="preserve"> 15.10.2026</w:t>
+        <w:t xml:space="preserve"> 17.10.2026</w:t>
       </w:r>
     </w:p>
     <w:p>
@@ -185,25 +185,7 @@
           <w:sz w:val="20"/>
           <w:szCs w:val="20"/>
         </w:rPr>
-        <w:t xml:space="preserve"> 1.7 (Ein Projekt – ein Video: genau </w:t>
-      </w:r>
-      <w:r>
-        <w:rPr>
-          <w:rFonts w:ascii="Arial" w:cs="Arial" w:eastAsia="Arial" w:hAnsi="Arial"/>
-          <w:b/>
-          <w:bCs/>
-          <w:sz w:val="20"/>
-          <w:szCs w:val="20"/>
-        </w:rPr>
-        <w:t xml:space="preserve">ein</w:t>
-      </w:r>
-      <w:r>
-        <w:rPr>
-          <w:rFonts w:ascii="Arial" w:cs="Arial" w:eastAsia="Arial" w:hAnsi="Arial"/>
-          <w:sz w:val="20"/>
-          <w:szCs w:val="20"/>
-        </w:rPr>
-        <w:t xml:space="preserve"> Video je Projekt, Import beim Anlegen und im Projekt-Editor, Ersetzen mit Bestätigung, automatische Übernahme in die Wiedergabeliste, s. 4.9)</w:t>
+        <w:t xml:space="preserve"> 1.8 (Aktion unterbricht das Video: entschiedenes Modell „Einschub am Video" – Video-Teil · Aktion · Video-Teil, frame-genau, das Video bleibt EIN Element; s. 4.5)</w:t>
       </w:r>
     </w:p>
     <w:p>
@@ -7231,7 +7213,7 @@
           <w:sz w:val="20"/>
           <w:szCs w:val="20"/>
         </w:rPr>
-        <w:t xml:space="preserve">Kurze Unterbrechung (neu):</w:t>
+        <w:t xml:space="preserve">Kurze Unterbrechung (entschieden 17.10.2026):</w:t>
       </w:r>
       <w:r>
         <w:rPr>
@@ -7257,8 +7239,13 @@
           <w:sz w:val="20"/>
           <w:szCs w:val="20"/>
         </w:rPr>
-        <w:t xml:space="preserve"> das Video – das Video </w:t>
-      </w:r>
+        <w:t xml:space="preserve"> das Video – das Video</w:t>
+      </w:r>
+    </w:p>
+    <w:p>
+      <w:pPr>
+        <w:spacing w:after="120"/>
+      </w:pPr>
       <w:r>
         <w:rPr>
           <w:rFonts w:ascii="Arial" w:cs="Arial" w:eastAsia="Arial" w:hAnsi="Arial"/>
@@ -7275,20 +7262,7 @@
           <w:sz w:val="20"/>
           <w:szCs w:val="20"/>
         </w:rPr>
-        <w:t xml:space="preserve">, die</w:t>
-      </w:r>
-    </w:p>
-    <w:p>
-      <w:pPr>
-        <w:spacing w:after="120"/>
-      </w:pPr>
-      <w:r>
-        <w:rPr>
-          <w:rFonts w:ascii="Arial" w:cs="Arial" w:eastAsia="Arial" w:hAnsi="Arial"/>
-          <w:sz w:val="20"/>
-          <w:szCs w:val="20"/>
-        </w:rPr>
-        <w:t xml:space="preserve">Aktion läuft, danach läuft das Video </w:t>
+        <w:t xml:space="preserve">, die Aktion läuft, danach läuft das Video </w:t>
       </w:r>
       <w:r>
         <w:rPr>
@@ -7306,20 +7280,185 @@
           <w:sz w:val="20"/>
           <w:szCs w:val="20"/>
         </w:rPr>
-        <w:t xml:space="preserve">. Modell und Render hierfür sind</w:t>
-      </w:r>
-    </w:p>
-    <w:p>
-      <w:pPr>
-        <w:spacing w:after="120"/>
-      </w:pPr>
-      <w:r>
-        <w:rPr>
-          <w:rFonts w:ascii="Arial" w:cs="Arial" w:eastAsia="Arial" w:hAnsi="Arial"/>
-          <w:sz w:val="20"/>
-          <w:szCs w:val="20"/>
-        </w:rPr>
-        <w:t xml:space="preserve">noch zu entwerfen (s. Technisches Konzept 9.7.7).</w:t>
+        <w:t xml:space="preserve">. Die</w:t>
+      </w:r>
+    </w:p>
+    <w:p>
+      <w:pPr>
+        <w:spacing w:after="120"/>
+      </w:pPr>
+      <w:r>
+        <w:rPr>
+          <w:rFonts w:ascii="Arial" w:cs="Arial" w:eastAsia="Arial" w:hAnsi="Arial"/>
+          <w:sz w:val="20"/>
+          <w:szCs w:val="20"/>
+        </w:rPr>
+        <w:t xml:space="preserve">Unterbrechung ist ein </w:t>
+      </w:r>
+      <w:r>
+        <w:rPr>
+          <w:rFonts w:ascii="Arial" w:cs="Arial" w:eastAsia="Arial" w:hAnsi="Arial"/>
+          <w:b/>
+          <w:bCs/>
+          <w:sz w:val="20"/>
+          <w:szCs w:val="20"/>
+        </w:rPr>
+        <w:t xml:space="preserve">Einschub am Video-Element</w:t>
+      </w:r>
+      <w:r>
+        <w:rPr>
+          <w:rFonts w:ascii="Arial" w:cs="Arial" w:eastAsia="Arial" w:hAnsi="Arial"/>
+          <w:sz w:val="20"/>
+          <w:szCs w:val="20"/>
+        </w:rPr>
+        <w:t xml:space="preserve"> (</w:t>
+      </w:r>
+      <w:r>
+        <w:rPr>
+          <w:rFonts w:ascii="Consolas" w:cs="Consolas" w:eastAsia="Consolas" w:hAnsi="Consolas"/>
+          <w:sz w:val="19"/>
+          <w:szCs w:val="19"/>
+          <w:shd w:fill="F5F5F3" w:val="clear"/>
+        </w:rPr>
+        <w:t xml:space="preserve">unterbrechungen</w:t>
+      </w:r>
+      <w:r>
+        <w:rPr>
+          <w:rFonts w:ascii="Arial" w:cs="Arial" w:eastAsia="Arial" w:hAnsi="Arial"/>
+          <w:sz w:val="20"/>
+          <w:szCs w:val="20"/>
+        </w:rPr>
+        <w:t xml:space="preserve">, Technisches Konzept 9.11.3):</w:t>
+      </w:r>
+    </w:p>
+    <w:p>
+      <w:pPr>
+        <w:spacing w:after="120"/>
+      </w:pPr>
+      <w:r>
+        <w:rPr>
+          <w:rFonts w:ascii="Arial" w:cs="Arial" w:eastAsia="Arial" w:hAnsi="Arial"/>
+          <w:sz w:val="20"/>
+          <w:szCs w:val="20"/>
+        </w:rPr>
+        <w:t xml:space="preserve">das Video bleibt </w:t>
+      </w:r>
+      <w:r>
+        <w:rPr>
+          <w:rFonts w:ascii="Arial" w:cs="Arial" w:eastAsia="Arial" w:hAnsi="Arial"/>
+          <w:b/>
+          <w:bCs/>
+          <w:sz w:val="20"/>
+          <w:szCs w:val="20"/>
+        </w:rPr>
+        <w:t xml:space="preserve">EIN</w:t>
+      </w:r>
+      <w:r>
+        <w:rPr>
+          <w:rFonts w:ascii="Arial" w:cs="Arial" w:eastAsia="Arial" w:hAnsi="Arial"/>
+          <w:sz w:val="20"/>
+          <w:szCs w:val="20"/>
+        </w:rPr>
+        <w:t xml:space="preserve"> Element und wird im Render </w:t>
+      </w:r>
+      <w:r>
+        <w:rPr>
+          <w:rFonts w:ascii="Arial" w:cs="Arial" w:eastAsia="Arial" w:hAnsi="Arial"/>
+          <w:b/>
+          <w:bCs/>
+          <w:sz w:val="20"/>
+          <w:szCs w:val="20"/>
+        </w:rPr>
+        <w:t xml:space="preserve">frame-genau</w:t>
+      </w:r>
+      <w:r>
+        <w:rPr>
+          <w:rFonts w:ascii="Arial" w:cs="Arial" w:eastAsia="Arial" w:hAnsi="Arial"/>
+          <w:sz w:val="20"/>
+          <w:szCs w:val="20"/>
+        </w:rPr>
+        <w:t xml:space="preserve"> in </w:t>
+      </w:r>
+      <w:r>
+        <w:rPr>
+          <w:rFonts w:ascii="Arial" w:cs="Arial" w:eastAsia="Arial" w:hAnsi="Arial"/>
+          <w:sz w:val="20"/>
+          <w:szCs w:val="20"/>
+        </w:rPr>
+        <w:t xml:space="preserve"/>
+      </w:r>
+      <w:r>
+        <w:rPr>
+          <w:rFonts w:ascii="Arial" w:cs="Arial" w:eastAsia="Arial" w:hAnsi="Arial"/>
+          <w:sz w:val="20"/>
+          <w:szCs w:val="20"/>
+        </w:rPr>
+        <w:t xml:space="preserve">Video-Teil · Aktion ·</w:t>
+      </w:r>
+    </w:p>
+    <w:p>
+      <w:pPr>
+        <w:spacing w:after="120"/>
+      </w:pPr>
+      <w:r>
+        <w:rPr>
+          <w:rFonts w:ascii="Arial" w:cs="Arial" w:eastAsia="Arial" w:hAnsi="Arial"/>
+          <w:sz w:val="20"/>
+          <w:szCs w:val="20"/>
+        </w:rPr>
+        <w:t xml:space="preserve">Video-Teil</w:t>
+      </w:r>
+      <w:r>
+        <w:rPr>
+          <w:rFonts w:ascii="Arial" w:cs="Arial" w:eastAsia="Arial" w:hAnsi="Arial"/>
+          <w:b/>
+          <w:bCs/>
+          <w:sz w:val="20"/>
+          <w:szCs w:val="20"/>
+        </w:rPr>
+        <w:t xml:space="preserve"> zerlegt (9.2.9). So bleibt das </w:t>
+      </w:r>
+      <w:r>
+        <w:rPr>
+          <w:rFonts w:ascii="Arial" w:cs="Arial" w:eastAsia="Arial" w:hAnsi="Arial"/>
+          <w:sz w:val="20"/>
+          <w:szCs w:val="20"/>
+        </w:rPr>
+        <w:t xml:space="preserve">sequenzielle</w:t>
+      </w:r>
+      <w:r>
+        <w:rPr>
+          <w:rFonts w:ascii="Arial" w:cs="Arial" w:eastAsia="Arial" w:hAnsi="Arial"/>
+          <w:b/>
+          <w:bCs/>
+          <w:sz w:val="20"/>
+          <w:szCs w:val="20"/>
+        </w:rPr>
+        <w:t xml:space="preserve"> Gegenstück zum </w:t>
+      </w:r>
+      <w:r>
+        <w:rPr>
+          <w:rFonts w:ascii="Arial" w:cs="Arial" w:eastAsia="Arial" w:hAnsi="Arial"/>
+          <w:sz w:val="20"/>
+          <w:szCs w:val="20"/>
+        </w:rPr>
+        <w:t xml:space="preserve">parallelen</w:t>
+      </w:r>
+      <w:r>
+        <w:rPr>
+          <w:rFonts w:ascii="Arial" w:cs="Arial" w:eastAsia="Arial" w:hAnsi="Arial"/>
+          <w:sz w:val="20"/>
+          <w:szCs w:val="20"/>
+        </w:rPr>
+        <w:t xml:space="preserve"/>
+      </w:r>
+      <w:r>
+        <w:rPr>
+          <w:rFonts w:ascii="Arial" w:cs="Arial" w:eastAsia="Arial" w:hAnsi="Arial"/>
+          <w:sz w:val="20"/>
+          <w:szCs w:val="20"/>
+        </w:rPr>
+        <w:t xml:space="preserve"> Band.</w:t>
       </w:r>
     </w:p>
     <w:p>

</xml_diff>

<commit_message>
doku: FA-13 entschieden - Einblendung anlegbar, Bandhoehe fest 162 (AD v1.9/TK v3.28)
</commit_message>
<xml_diff>
--- a/docs/Anforderungsdokument_Digital-Signage-Tool.docx
+++ b/docs/Anforderungsdokument_Digital-Signage-Tool.docx
@@ -162,7 +162,7 @@
           <w:sz w:val="20"/>
           <w:szCs w:val="20"/>
         </w:rPr>
-        <w:t xml:space="preserve"> 17.10.2026</w:t>
+        <w:t xml:space="preserve"> 23.10.2026</w:t>
       </w:r>
     </w:p>
     <w:p>
@@ -185,7 +185,7 @@
           <w:sz w:val="20"/>
           <w:szCs w:val="20"/>
         </w:rPr>
-        <w:t xml:space="preserve"> 1.8 (Aktion unterbricht das Video: entschiedenes Modell „Einschub am Video" – Video-Teil · Aktion · Video-Teil, frame-genau, das Video bleibt EIN Element; s. 4.5)</w:t>
+        <w:t xml:space="preserve"> 1.9 (Bandhöhe eigener Vorlagen ist fest 162 px – auch für die Einblendung; die frühere Zusage „höhere Bänder sind möglich" ist bewusst zurückgenommen, s. 4.5)</w:t>
       </w:r>
     </w:p>
     <w:p>
@@ -2537,7 +2537,25 @@
                 <w:sz w:val="20"/>
                 <w:szCs w:val="20"/>
               </w:rPr>
-              <w:t xml:space="preserve"> (s. 4.5). Eine eigene Vorlage arrangiert nur die </w:t>
+              <w:t xml:space="preserve"> (s. 4.5). Die </w:t>
+            </w:r>
+            <w:r>
+              <w:rPr>
+                <w:rFonts w:ascii="Arial" w:cs="Arial" w:eastAsia="Arial" w:hAnsi="Arial"/>
+                <w:b/>
+                <w:bCs/>
+                <w:sz w:val="20"/>
+                <w:szCs w:val="20"/>
+              </w:rPr>
+              <w:t xml:space="preserve">Bandhöhe ist für beide Bandarten fest 162 px</w:t>
+            </w:r>
+            <w:r>
+              <w:rPr>
+                <w:rFonts w:ascii="Arial" w:cs="Arial" w:eastAsia="Arial" w:hAnsi="Arial"/>
+                <w:sz w:val="20"/>
+                <w:szCs w:val="20"/>
+              </w:rPr>
+              <w:t xml:space="preserve"> (Entscheidung 23.10.2026, s. 4.5). Eine eigene Vorlage arrangiert nur die </w:t>
             </w:r>
             <w:r>
               <w:rPr>
@@ -6726,7 +6744,25 @@
           <w:sz w:val="20"/>
           <w:szCs w:val="20"/>
         </w:rPr>
-        <w:t xml:space="preserve"> und verdeckt den unteren Bildbereich. Vorteil: das Video behält seine volle Größe, ohne Seitenbalken.</w:t>
+        <w:t xml:space="preserve"> und verdeckt den unteren Bildbereich. Vorteil: das Video behält seine volle Größe, ohne Seitenbalken. Das Band ist </w:t>
+      </w:r>
+      <w:r>
+        <w:rPr>
+          <w:rFonts w:ascii="Arial" w:cs="Arial" w:eastAsia="Arial" w:hAnsi="Arial"/>
+          <w:b/>
+          <w:bCs/>
+          <w:sz w:val="20"/>
+          <w:szCs w:val="20"/>
+        </w:rPr>
+        <w:t xml:space="preserve">halbtransparent</w:t>
+      </w:r>
+      <w:r>
+        <w:rPr>
+          <w:rFonts w:ascii="Arial" w:cs="Arial" w:eastAsia="Arial" w:hAnsi="Arial"/>
+          <w:sz w:val="20"/>
+          <w:szCs w:val="20"/>
+        </w:rPr>
+        <w:t xml:space="preserve"> (Verlauf von durchsichtig zu 70 % Schwarz), damit das Video darunter sichtbar bleibt – deckend wäre es optisch ein Split-Screen.</w:t>
       </w:r>
     </w:p>
     <w:p>
@@ -7033,7 +7069,84 @@
           <w:sz w:val="20"/>
           <w:szCs w:val="20"/>
         </w:rPr>
-        <w:t xml:space="preserve"> (Logo, Titel, Preis/CTA); eine längere Beschreibung ist dort nicht vorgesehen. Höhere Bänder sind über eigene Vorlagen möglich — sie verkleinern beim Split-Screen entsprechend das Video.</w:t>
+        <w:t xml:space="preserve"> (Logo, Titel, Preis/CTA); eine längere Beschreibung ist dort nicht vorgesehen.</w:t>
+      </w:r>
+    </w:p>
+    <w:p>
+      <w:pPr>
+        <w:spacing w:after="120"/>
+      </w:pPr>
+      <w:r>
+        <w:rPr>
+          <w:rFonts w:ascii="Arial" w:cs="Arial" w:eastAsia="Arial" w:hAnsi="Arial"/>
+          <w:b/>
+          <w:bCs/>
+          <w:sz w:val="20"/>
+          <w:szCs w:val="20"/>
+        </w:rPr>
+        <w:t xml:space="preserve">Die Bandhöhe ist fest (Entscheidung 23.10.2026):</w:t>
+      </w:r>
+      <w:r>
+        <w:rPr>
+          <w:rFonts w:ascii="Arial" w:cs="Arial" w:eastAsia="Arial" w:hAnsi="Arial"/>
+          <w:sz w:val="20"/>
+          <w:szCs w:val="20"/>
+        </w:rPr>
+        <w:t xml:space="preserve"> Eigene Band-Vorlagen – Split-Screen </w:t>
+      </w:r>
+      <w:r>
+        <w:rPr>
+          <w:rFonts w:ascii="Arial" w:cs="Arial" w:eastAsia="Arial" w:hAnsi="Arial"/>
+          <w:b/>
+          <w:bCs/>
+          <w:sz w:val="20"/>
+          <w:szCs w:val="20"/>
+        </w:rPr>
+        <w:t xml:space="preserve">und</w:t>
+      </w:r>
+      <w:r>
+        <w:rPr>
+          <w:rFonts w:ascii="Arial" w:cs="Arial" w:eastAsia="Arial" w:hAnsi="Arial"/>
+          <w:sz w:val="20"/>
+          <w:szCs w:val="20"/>
+        </w:rPr>
+        <w:t xml:space="preserve"> Einblendung – werden mit </w:t>
+      </w:r>
+      <w:r>
+        <w:rPr>
+          <w:rFonts w:ascii="Arial" w:cs="Arial" w:eastAsia="Arial" w:hAnsi="Arial"/>
+          <w:b/>
+          <w:bCs/>
+          <w:sz w:val="20"/>
+          <w:szCs w:val="20"/>
+        </w:rPr>
+        <w:t xml:space="preserve">162 px</w:t>
+      </w:r>
+      <w:r>
+        <w:rPr>
+          <w:rFonts w:ascii="Arial" w:cs="Arial" w:eastAsia="Arial" w:hAnsi="Arial"/>
+          <w:sz w:val="20"/>
+          <w:szCs w:val="20"/>
+        </w:rPr>
+        <w:t xml:space="preserve"> angelegt. Ein Höhenfeld bietet die Oberfläche nicht; </w:t>
+      </w:r>
+      <w:r>
+        <w:rPr>
+          <w:rFonts w:ascii="Arial" w:cs="Arial" w:eastAsia="Arial" w:hAnsi="Arial"/>
+          <w:b/>
+          <w:bCs/>
+          <w:sz w:val="20"/>
+          <w:szCs w:val="20"/>
+        </w:rPr>
+        <w:t xml:space="preserve">höhere Bänder sind nicht vorgesehen</w:t>
+      </w:r>
+      <w:r>
+        <w:rPr>
+          <w:rFonts w:ascii="Arial" w:cs="Arial" w:eastAsia="Arial" w:hAnsi="Arial"/>
+          <w:sz w:val="20"/>
+          <w:szCs w:val="20"/>
+        </w:rPr>
+        <w:t xml:space="preserve">. Grund: Der Markenrahmen (Logo, Sicherheitsabstand) ist auf 162 px zugeschnitten; eine freie Höhe verlangte eine Skalierungsregel für das Logo, die das Technische Konzept an keiner Stelle festlegt und die als automatisches Umlayouten ausdrücklich verboten ist (TK 9.11.1 Punkt 3). Diese Festlegung ersetzt die frühere Zusage „Höhere Bänder sind über eigene Vorlagen möglich".</w:t>
       </w:r>
     </w:p>
     <w:p>
@@ -12134,7 +12247,25 @@
           <w:sz w:val="20"/>
           <w:szCs w:val="20"/>
         </w:rPr>
-        <w:t xml:space="preserve"> Der schmale Bereich mit Werbeinhalt bei Split-Screen bzw. Einblendung; seine Höhe legt die Vorlage fest.</w:t>
+        <w:t xml:space="preserve"> Der schmale Bereich mit Werbeinhalt bei Split-Screen bzw. Einblendung; seine Höhe ist fest </w:t>
+      </w:r>
+      <w:r>
+        <w:rPr>
+          <w:rFonts w:ascii="Arial" w:cs="Arial" w:eastAsia="Arial" w:hAnsi="Arial"/>
+          <w:b/>
+          <w:bCs/>
+          <w:sz w:val="20"/>
+          <w:szCs w:val="20"/>
+        </w:rPr>
+        <w:t xml:space="preserve">162 px</w:t>
+      </w:r>
+      <w:r>
+        <w:rPr>
+          <w:rFonts w:ascii="Arial" w:cs="Arial" w:eastAsia="Arial" w:hAnsi="Arial"/>
+          <w:sz w:val="20"/>
+          <w:szCs w:val="20"/>
+        </w:rPr>
+        <w:t xml:space="preserve"> (4.5).</w:t>
       </w:r>
     </w:p>
     <w:p>

</xml_diff>